<commit_message>
Revise manuscript around verifier method and figures
</commit_message>
<xml_diff>
--- a/manuscripts/eplacement_kyc_v4_1_validation/eplacement_kyc_verifier_v4_1_validation_manuscript.docx
+++ b/manuscripts/eplacement_kyc_v4_1_validation/eplacement_kyc_verifier_v4_1_validation_manuscript.docx
@@ -7,7 +7,7 @@
         <w:pStyle w:val="Title"/>
       </w:pPr>
       <w:r>
-        <w:t>Validation of a local-first claim-guided document evidence verifier for Malaysian ePlacement applications: a retrospective diagnostic accuracy study</w:t>
+        <w:t>Claim-guided document evidence verification for public-sector human-resource applications: development and evaluation of a local-first AI-assisted workflow</w:t>
       </w:r>
     </w:p>
     <w:p>
@@ -17,7 +17,7 @@
     </w:p>
     <w:p>
       <w:r>
-        <w:t>Draft date: 2026-05-06</w:t>
+        <w:t>Draft date: 2026-05-07</w:t>
       </w:r>
     </w:p>
     <w:p>
@@ -27,7 +27,7 @@
     </w:p>
     <w:p>
       <w:r>
-        <w:t>Algorithm version evaluated: eplacement-kyc-verifier v4.1</w:t>
+        <w:t>Manuscript status: revised development-and-evaluation draft</w:t>
       </w:r>
     </w:p>
     <w:p>
@@ -35,7 +35,7 @@
         <w:pStyle w:val="Heading1"/>
       </w:pPr>
       <w:r>
-        <w:t>Structured Abstract</w:t>
+        <w:t>Abstract</w:t>
       </w:r>
     </w:p>
     <w:p>
@@ -48,7 +48,7 @@
     </w:p>
     <w:p>
       <w:r>
-        <w:t>Administrative placement systems often require applicants to upload documentary evidence for family, health, disability, marital, spouse-location, and professional examination claims. In practice, these checks are document-heavy, multilingual, and difficult to standardise. Commercial electronic know-your-customer (e-KYC) systems increasingly automate identity proofing, but they are usually built around identity documents, biometrics, liveness checks, and vendor-controlled infrastructure. Less is known about local-first evidence verification systems designed for public-sector administrative workflows where the objective is not full identity proofing, but rapid, auditable triage of whether claimed evidence is supported by uploaded documents.</w:t>
+        <w:t>Public-sector human-resource application systems often require applicants to support personal, family, health, spouse-location, disability and examination-related claims with documentary proof. This creates a recurring administrative bottleneck: reviewers must reconcile structured form declarations with heterogeneous uploaded PDFs, many of which are scanned, multilingual, multi-page and only partially relevant. Existing electronic know-your-customer and digital identity systems address adjacent problems, but usually emphasise identity proofing, biometrics, liveness detection and document authenticity rather than claim-specific administrative evidence verification. A transparent, locally deployable method for first-pass proof checking could reduce avoidable manual review while preserving auditability and human oversight.</w:t>
       </w:r>
     </w:p>
     <w:p>
@@ -61,7 +61,7 @@
     </w:p>
     <w:p>
       <w:r>
-        <w:t>We aimed to validate a local-first, claim-guided document evidence verifier for Malaysian ePlacement applications, focusing on whether the system could identify uploaded proof for six applicant-claimed evidence categories while reducing manual review workload.</w:t>
+        <w:t>We aimed to develop and evaluate a local-first, claim-guided document evidence verifier for public-sector human-resource applications. The primary contribution is the method: a workflow that reads applicant-declared claims, verifies only the evidence categories that were claimed, uses optical character recognition and local vision-language model inference to inspect uploaded PDFs, and produces auditable outputs for human review.</w:t>
       </w:r>
     </w:p>
     <w:p>
@@ -74,7 +74,7 @@
     </w:p>
     <w:p>
       <w:r>
-        <w:t>We conducted a retrospective validation study using a manually adjudicated reference set of 238 applicants. Each applicant contributed six evidence-level binary decisions: marriage, self illness, family illness, spouse location, OKU self or family, and MedEX or other examination evidence, yielding 1,428 binary decisions. The evaluated system ingested applicant spreadsheet data, extracted claimed evidence categories, retrieved and rendered supporting PDFs, routed text extraction through direct PDF text and optical character recognition (OCR), and applied a claim-guided evidence verification workflow using deterministic rules and local language/vision model support. We assessed sensitivity, specificity, positive predictive value (PPV), negative predictive value (NPV), F1 score, exact applicant-level agreement, and manual review burden.</w:t>
+        <w:t>We designed the verifier as a modular, human-in-the-loop document AI workflow. The system ingests structured applicant data, converts relevant fields into six claim booleans, retrieves uploaded PDF evidence, extracts direct PDF text where possible, renders scanned pages, routes low-text pages through OCR, and uses a locally hosted multimodal model through an orchestration harness to verify whether claimed categories are supported by visible document evidence. The six proof categories were marriage, self illness, family illness, spouse location, OKU self or family, and MedEX or other examination evidence. Unclaimed categories were deliberately skipped to reduce false-positive labelling. The system exported final tick sheets, scoring sheets, decision queues, proof-strength fields, page references, original PDF links and evidence summaries. We evaluated the method retrospectively against a manually adjudicated reference set of 238 applicants, corresponding to 1,428 applicant-evidence decisions.</w:t>
       </w:r>
     </w:p>
     <w:p>
@@ -87,7 +87,7 @@
     </w:p>
     <w:p>
       <w:r>
-        <w:t>Across 1,428 evidence-level decisions, the verifier produced 415 true positives, 103 false positives, 856 true negatives, and 54 false negatives. Overall accuracy was 89.0%, sensitivity was 88.5%, specificity was 89.3%, PPV was 80.1%, NPV was 94.1%, and F1 score was 84.1%. Exact applicant-level agreement, defined as all six evidence classes matching the manual reference standard for a given applicant, was 118/238 (49.6%). The system flagged 64/238 applicants for manual review, corresponding to a manual review rate of 26.9% and a potential first-pass clearance rate of 73.1%. Performance varied by evidence type: marriage evidence had high precision and F1 score, while family illness and spouse-location evidence accounted for most false-positive burden. Version 4.1 produced the same predictions and check-required flags as version 4, but added proof-strength and audit fields for downstream review.</w:t>
+        <w:t>The developed verifier completed the full evidence workflow and produced auditable applicant-level outputs. In the final validation set, it produced 415 true-positive, 103 false-positive, 856 true-negative and 54 false-negative evidence-level decisions. Overall accuracy was 89.0%, sensitivity 88.5%, specificity 89.3%, positive predictive value 80.1%, negative predictive value 94.1% and F1 score 84.1%. Exact applicant-level agreement across all six categories was 118/238 (49.6%). The system routed 64/238 applicants (26.9%) for manual review, implying that 174/238 (73.1%) could be handled through a first-pass no-check stream subject to governance controls. Performance was strongest for marriage and MedEX or other examination evidence, while family illness and spouse-location proof remained the main residual error sources.</w:t>
       </w:r>
     </w:p>
     <w:p>
@@ -95,17 +95,68 @@
         <w:pStyle w:val="Heading2"/>
       </w:pPr>
       <w:r>
-        <w:t>Conclusion</w:t>
+        <w:t>Conclusions</w:t>
       </w:r>
     </w:p>
     <w:p>
       <w:r>
-        <w:t>The validated system showed substantial improvement over early broad-classification versions and achieved decision-level performance consistent with a useful first-pass triage tool. However, residual applicant-level disagreement and incomplete capture of residual errors by the review flag mean it should not be deployed as an autonomous adjudication system. The appropriate near-term use case is AI-assisted evidence triage with structured audit, targeted manual review, and ongoing recalibration.</w:t>
+        <w:t>This work describes the development of a claim-guided, local-first AI-assisted method for administrative document evidence verification. The key advance is not a single model, but a constrained verification harness that combines structured claims, OCR routing, local multimodal inference, deterministic proof rules and auditable review outputs. The method appears useful as first-pass triage, but not as autonomous adjudication. Deployment should therefore be framed as decision support: reducing routine review burden, improving traceability and focusing human attention on missing, ambiguous or low-confidence proof.</w:t>
       </w:r>
     </w:p>
     <w:p>
       <w:r>
-        <w:t>Keywords: document AI; e-KYC; administrative evidence verification; OCR; multimodal language models; human-in-the-loop review; Malaysia; digital epidemiology</w:t>
+        <w:t>Keywords: document AI; human-resource applications; evidence verification; optical character recognition; vision-language model; local-first AI; human-in-the-loop; public-sector digital health</w:t>
+      </w:r>
+    </w:p>
+    <w:p>
+      <w:pPr>
+        <w:jc w:val="center"/>
+      </w:pPr>
+      <w:r>
+        <w:drawing>
+          <wp:inline xmlns:a="http://schemas.openxmlformats.org/drawingml/2006/main" xmlns:pic="http://schemas.openxmlformats.org/drawingml/2006/picture">
+            <wp:extent cx="6217920" cy="3532909"/>
+            <wp:docPr id="1" name="Picture 1"/>
+            <wp:cNvGraphicFramePr>
+              <a:graphicFrameLocks noChangeAspect="1"/>
+            </wp:cNvGraphicFramePr>
+            <a:graphic>
+              <a:graphicData uri="http://schemas.openxmlformats.org/drawingml/2006/picture">
+                <pic:pic>
+                  <pic:nvPicPr>
+                    <pic:cNvPr id="0" name="figure_1_problem_contribution.png"/>
+                    <pic:cNvPicPr/>
+                  </pic:nvPicPr>
+                  <pic:blipFill>
+                    <a:blip r:embed="rId9"/>
+                    <a:stretch>
+                      <a:fillRect/>
+                    </a:stretch>
+                  </pic:blipFill>
+                  <pic:spPr>
+                    <a:xfrm>
+                      <a:off x="0" y="0"/>
+                      <a:ext cx="6217920" cy="3532909"/>
+                    </a:xfrm>
+                    <a:prstGeom prst="rect"/>
+                  </pic:spPr>
+                </pic:pic>
+              </a:graphicData>
+            </a:graphic>
+          </wp:inline>
+        </w:drawing>
+      </w:r>
+    </w:p>
+    <w:p>
+      <w:pPr>
+        <w:jc w:val="center"/>
+      </w:pPr>
+      <w:r>
+        <w:rPr>
+          <w:i/>
+          <w:sz w:val="18"/>
+        </w:rPr>
+        <w:t>Figure 1. Administrative evidence verification problem and contribution.</w:t>
       </w:r>
     </w:p>
     <w:p>
@@ -118,22 +169,32 @@
     </w:p>
     <w:p>
       <w:r>
-        <w:t>Administrative placement decisions increasingly depend on structured applicant-declared information and unstructured supporting documents. In the Malaysian ePlacement context, applicants may submit evidence relating to marriage, spouse location, personal illness, family illness, OKU or disability status, and postgraduate or MedEX-related examination obligations. These domains are consequential because they influence placement prioritisation and require trust in both applicant declarations and uploaded evidence. However, the operational reality is difficult: supporting documents are heterogeneous, often multilingual, variably scanned, and frequently bundled into multi-page PDFs containing unrelated or partially related evidence.</w:t>
+        <w:t>Human-resource application systems in large public services often depend on documentary proof. Applicants may declare that they are married, that a spouse is posted in a particular location, that they or a family member have health needs, that a disability-related consideration applies, or that a postgraduate or professional examination obligation should be considered. These claims are not merely clerical details. They can shape placement, transfer, prioritisation and review decisions. In health systems, where workforce distribution affects service access and continuity, administrative proof checking sits inside a wider policy problem: ensuring the right people are available in the right places while maintaining fair, transparent and defensible application processes [1,2].</w:t>
       </w:r>
     </w:p>
     <w:p>
       <w:r>
-        <w:t>Manual review remains the default control for these workflows. It is interpretable and flexible, but it is also slow, repetitive, vulnerable to fatigue, and hard to scale consistently. A naive automation approach can perform poorly for two reasons. First, a broad document classifier may label any plausible evidence type it sees, even when the applicant did not claim that category. Second, a language or vision model may appear confident while missing visually obvious but OCR-poor documents, such as scanned marriage certificates or documents using non-Latin scripts. These failure modes are especially relevant in public-sector settings where documents may include Bahasa Malaysia, English, Jawi or Arabic-script text, and other regional language content.</w:t>
+        <w:t>The proof-checking task is deceptively difficult. The structured form may be clean, but the supporting evidence is rarely clean. Applicants upload scanned marriage certificates, spouse posting letters, medical appointment notes, hospital reports, OKU cards, examination slips, screenshots, multi-document bundles and sometimes irrelevant or incomplete files. A single PDF can contain several unrelated pages. Some documents have extractable text; others are image-only. Some are in English, Bahasa Malaysia or Arabic-script/Jawi-like formats; others contain names, identity numbers, handwritten annotations, stamps and seals that are visually meaningful but poorly represented by optical character recognition (OCR). In these circumstances, manual review is slow but robust. Naive automation is fast but brittle.</w:t>
       </w:r>
     </w:p>
     <w:p>
       <w:r>
-        <w:t>The term e-KYC is often used broadly, but the task evaluated here is narrower than full remote identity proofing. Full e-KYC systems typically include identity document authenticity checks, biometric face matching, liveness or presentation attack detection, sanctions or watchlist screening, device intelligence, and risk scoring. The eplacement-kyc-verifier system is better understood as a local-first administrative evidence verification tool with e-KYC relevance. Its immediate purpose is to help operators determine whether applicant-claimed evidence appears to be supported by uploaded PDFs, while preserving a human-review pathway and audit trail.</w:t>
+        <w:t>The central methodological problem is therefore not simply "classify a PDF". In an administrative application workflow, the task is claim-guided proof verification. The system should first ask what the applicant claimed, then inspect whether the uploaded document supports those claims. A broad classifier that labels every plausible category in a PDF can create false positives, because it may infer evidence that the applicant never declared. Conversely, a conservative text-only system can create false negatives when proof is visually obvious but OCR is poor. The verifier developed here was designed around this tension.</w:t>
       </w:r>
     </w:p>
     <w:p>
       <w:r>
-        <w:t>We aimed to evaluate the final v4.1 validation of this verifier against a manually adjudicated reference set. The primary scientific question was whether a claim-guided approach could provide useful evidence-level classification performance while reducing the number of applicants requiring manual review. The secondary question was whether the system's review flag was sufficiently conservative to identify uncertain or problematic cases for human adjudication.</w:t>
+        <w:t>This paper reports the development and evaluation of a local-first AI-assisted evidence verification workflow for public-sector human-resource applications. We use "local-first" deliberately. The system was designed to run with local storage, local OCR and local language or vision-language model inference, rather than sending sensitive applicant documents to external document-processing APIs. This matters because uploaded evidence may contain family relationships, health information, disability documentation, identity numbers, workplace locations and examination records. A local-first approach does not remove governance obligations, but it reduces avoidable external data flows and supports clearer audit.</w:t>
+      </w:r>
+    </w:p>
+    <w:p>
+      <w:r>
+        <w:t>The work also sits within a broader document AI and e-KYC landscape. Commercial electronic know-your-customer systems are increasingly sophisticated, combining identity document capture, authenticity checks, face matching, liveness detection, sanctions screening and risk scoring [3-5]. However, the present use case is narrower and different. The aim is not to prove a person's identity from first principles. It is to assist human operators in verifying whether applicant-declared administrative claims are supported by uploaded evidence. This distinction is important: overclaiming full e-KYC capability would be inaccurate, while underdescribing the AI harness would miss the main methodological contribution.</w:t>
+      </w:r>
+    </w:p>
+    <w:p>
+      <w:r>
+        <w:t>We therefore frame this as a methods-development study with retrospective validation. The objective was to build an auditable, claim-guided verifier and quantify its performance as a first-pass triage system. Accuracy is reported because the method must be evaluated, but accuracy is not the sole point of the paper. The main contribution is the architecture: structured claim extraction, evidence-category skipping, OCR-aware page processing, local multimodal verification, proof-strength scoring, and operator-facing outputs that preserve human review.</w:t>
       </w:r>
     </w:p>
     <w:p>
@@ -141,52 +202,125 @@
         <w:pStyle w:val="Heading1"/>
       </w:pPr>
       <w:r>
-        <w:t>Objectives</w:t>
+        <w:t>Related Work</w:t>
+      </w:r>
+    </w:p>
+    <w:p>
+      <w:pPr>
+        <w:pStyle w:val="Heading2"/>
+      </w:pPr>
+      <w:r>
+        <w:t>Administrative Evidence Verification and Workforce Applications</w:t>
       </w:r>
     </w:p>
     <w:p>
       <w:r>
-        <w:t>The objectives were:</w:t>
+        <w:t>Public-sector workforce systems frequently balance individual circumstances against service needs. In health workforce policy, international guidance emphasises the importance of staffing distribution, rural and remote access, retention, and transparent planning mechanisms [1,2]. Much of this literature concerns allocation, retention and workforce modelling rather than document verification itself. Yet in practice, many allocation or placement systems depend on administrative evidence: a claimed family, health, disability or training circumstance must be converted into a reviewable signal before it can inform a decision.</w:t>
+      </w:r>
+    </w:p>
+    <w:p>
+      <w:r>
+        <w:t>This creates a data-quality layer that is easy to understate. If evidence review is inconsistent, slow or opaque, downstream workforce decisions may become delayed, inequitable or difficult to audit. Conversely, if automation is too aggressive, applicants may be wrongly cleared or incorrectly flagged. The relevant policy problem is therefore not only efficiency; it is accountable administrative decision support.</w:t>
       </w:r>
     </w:p>
     <w:p>
       <w:pPr>
-        <w:pStyle w:val="ListBullet"/>
+        <w:pStyle w:val="Heading2"/>
       </w:pPr>
       <w:r>
-        <w:t>To estimate evidence-level sensitivity, specificity, PPV, NPV, accuracy, and F1 score for the v4.1 verifier across six evidence categories.</w:t>
+        <w:t>Document AI, OCR and Multimodal Understanding</w:t>
+      </w:r>
+    </w:p>
+    <w:p>
+      <w:r>
+        <w:t>Traditional OCR remains a core technology for digitising scanned documents. Tesseract is one of the most widely used open-source OCR engines and has long been applied to document analysis tasks [6]. PaddleOCR and the PP-OCR family extended practical OCR toward lightweight, multilingual and production-oriented pipelines [7,8]. More recent document AI approaches use Transformer architectures to model text, layout and images jointly. TrOCR recasts OCR as an end-to-end Transformer task [9]. LayoutLMv3 uses unified text and image masking for document AI pre-training [10]. Donut removes the external OCR dependency by treating document understanding as OCR-free image-to-sequence generation [11]. GeoLayoutLM emphasises geometric pre-training for visual information extraction [12].</w:t>
+      </w:r>
+    </w:p>
+    <w:p>
+      <w:r>
+        <w:t>These methods are relevant because administrative evidence is not only text. Layout, stamps, tables, official seals, document titles, signatures and page structure can all be meaningful. The verifier described here did not train a new document foundation model. Instead, it used a pragmatic harness: OCR and deterministic signals where they were reliable, page images where OCR was weak, and a local vision-language model where visual context mattered.</w:t>
       </w:r>
     </w:p>
     <w:p>
       <w:pPr>
-        <w:pStyle w:val="ListBullet"/>
+        <w:pStyle w:val="Heading2"/>
       </w:pPr>
       <w:r>
-        <w:t>To estimate applicant-level exact agreement across the full six-category evidence vector.</w:t>
+        <w:t>Vision-Language Models and Local Inference</w:t>
+      </w:r>
+    </w:p>
+    <w:p>
+      <w:r>
+        <w:t>Vision-language models (VLMs) are increasingly capable of interpreting documents, charts, diagrams and screenshots. Qwen2.5-VL, for example, reports strong performance on document and diagram understanding tasks and is available in model sizes compatible with local deployment on suitable hardware [13]. The local inference layer in this work was served through Ollama, which exposes a local API for running language models, including vision-capable models, on local machines [14]. Langflow was used as the visual and Python-based orchestration layer, allowing the workflow to be represented as components rather than a monolithic script [15].</w:t>
+      </w:r>
+    </w:p>
+    <w:p>
+      <w:r>
+        <w:t>The important design choice was not merely "use a VLM". Unconstrained VLM calls can hallucinate, over-label ambiguous pages, or produce unstructured text that is difficult to audit. The harness therefore constrained model use in four ways. First, the prompt supplied applicant claims and told the model to verify only claimed categories. Second, deterministic rules and OCR-derived signals shortlisted likely evidence pages. Third, model output was parsed into a fixed schema with proof status, proof strength, supporting page and evidence summary. Fourth, the system defaulted to manual review when proof was missing, ambiguous or low confidence.</w:t>
       </w:r>
     </w:p>
     <w:p>
       <w:pPr>
-        <w:pStyle w:val="ListBullet"/>
+        <w:pStyle w:val="Heading2"/>
       </w:pPr>
       <w:r>
-        <w:t>To quantify the manual review burden generated by the system.</w:t>
+        <w:t>Reporting and Governance of AI Decision Support</w:t>
+      </w:r>
+    </w:p>
+    <w:p>
+      <w:r>
+        <w:t>The reporting of AI-assisted decision support should separate development, validation and deployment. DECIDE-AI emphasises early-stage evaluation of AI decision-support systems and the importance of human-in-the-loop workflows [16]. CONSORT-AI and TRIPOD+AI similarly reflect the broader movement toward transparent reporting of AI methods, settings, failure modes and human interaction [17,18]. Diagnostic accuracy reporting guidance such as STARD remains useful when an algorithmic output is compared with a reference standard [19], but it does not by itself capture workflow design, auditability or operator burden. This manuscript therefore combines a development narrative with a validation analysis.</w:t>
       </w:r>
     </w:p>
     <w:p>
       <w:pPr>
-        <w:pStyle w:val="ListBullet"/>
+        <w:jc w:val="center"/>
       </w:pPr>
       <w:r>
-        <w:t>To characterise performance by evidence type and identify residual failure modes relevant to operational deployment.</w:t>
+        <w:drawing>
+          <wp:inline xmlns:a="http://schemas.openxmlformats.org/drawingml/2006/main" xmlns:pic="http://schemas.openxmlformats.org/drawingml/2006/picture">
+            <wp:extent cx="6217920" cy="3532909"/>
+            <wp:docPr id="2" name="Picture 2"/>
+            <wp:cNvGraphicFramePr>
+              <a:graphicFrameLocks noChangeAspect="1"/>
+            </wp:cNvGraphicFramePr>
+            <a:graphic>
+              <a:graphicData uri="http://schemas.openxmlformats.org/drawingml/2006/picture">
+                <pic:pic>
+                  <pic:nvPicPr>
+                    <pic:cNvPr id="0" name="figure_2_evidence_taxonomy.png"/>
+                    <pic:cNvPicPr/>
+                  </pic:nvPicPr>
+                  <pic:blipFill>
+                    <a:blip r:embed="rId10"/>
+                    <a:stretch>
+                      <a:fillRect/>
+                    </a:stretch>
+                  </pic:blipFill>
+                  <pic:spPr>
+                    <a:xfrm>
+                      <a:off x="0" y="0"/>
+                      <a:ext cx="6217920" cy="3532909"/>
+                    </a:xfrm>
+                    <a:prstGeom prst="rect"/>
+                  </pic:spPr>
+                </pic:pic>
+              </a:graphicData>
+            </a:graphic>
+          </wp:inline>
+        </w:drawing>
       </w:r>
     </w:p>
     <w:p>
       <w:pPr>
-        <w:pStyle w:val="ListBullet"/>
+        <w:jc w:val="center"/>
       </w:pPr>
       <w:r>
-        <w:t>To frame the system honestly within the broader digital identity and document AI landscape, distinguishing administrative evidence triage from full-stack e-KYC.</w:t>
+        <w:rPr>
+          <w:i/>
+          <w:sz w:val="18"/>
+        </w:rPr>
+        <w:t>Figure 2. Six proof categories used by the verifier.</w:t>
       </w:r>
     </w:p>
     <w:p>
@@ -207,7 +341,7 @@
     </w:p>
     <w:p>
       <w:r>
-        <w:t>We conducted a retrospective validation study of the eplacement-kyc-verifier v4.1 algorithm. The unit of primary analysis was the evidence-level binary decision. Each applicant could contribute one binary decision for each of six evidence categories, resulting in six decisions per applicant. Applicant-level agreement was assessed separately because an applicant could be correct for some evidence categories and incorrect for others.</w:t>
+        <w:t>We conducted a methods-development and retrospective evaluation study. The study object was a working software method for administrative evidence verification, not a standalone predictive model. Development was iterative and operationally driven: early broad-classification prototypes were replaced by a claim-guided verifier after error review showed that broad classification created false positives and missed visually obvious evidence. The final method was then evaluated against a manually adjudicated validation set.</w:t>
       </w:r>
     </w:p>
     <w:p>
@@ -215,12 +349,12 @@
         <w:pStyle w:val="Heading2"/>
       </w:pPr>
       <w:r>
-        <w:t>Setting and Workflow Context</w:t>
+        <w:t>Setting and Target Use Case</w:t>
       </w:r>
     </w:p>
     <w:p>
       <w:r>
-        <w:t>The workflow was designed for Malaysian ePlacement document review. Applicant data were provided as a structured spreadsheet, and supporting documents were provided as uploaded PDF links or local PDF paths. The operational goal was first-pass triage: identify applicants whose claimed evidence appeared sufficiently supported by uploaded documents, and route uncertain or unsupported cases to manual review.</w:t>
+        <w:t>The target use case was a public-sector human-resource application workflow in which applicants submit structured form data and upload supporting PDFs. The setting involved people applying for placement-related consideration and submitting documentary evidence for personal, family, spouse-location, health, disability or examination-related claims. The manuscript intentionally uses generic terminology because the method is not specific to one professional discipline. The same proof-checking problem can arise in any large administrative workforce process where declared circumstances must be supported by uploaded evidence.</w:t>
       </w:r>
     </w:p>
     <w:p>
@@ -228,12 +362,12 @@
         <w:pStyle w:val="Heading2"/>
       </w:pPr>
       <w:r>
-        <w:t>Evidence Categories</w:t>
+        <w:t>Design Requirements</w:t>
       </w:r>
     </w:p>
     <w:p>
       <w:r>
-        <w:t>The six evidence categories were:</w:t>
+        <w:t>We defined seven implementation requirements before the final evaluation:</w:t>
       </w:r>
     </w:p>
     <w:p>
@@ -241,7 +375,7 @@
         <w:pStyle w:val="ListBullet"/>
       </w:pPr>
       <w:r>
-        <w:t>Marriage: clear evidence of marriage or spouse relationship, including marriage or nikah certificates.</w:t>
+        <w:t>The system must read applicant claims before reading the document evidence.</w:t>
       </w:r>
     </w:p>
     <w:p>
@@ -249,7 +383,7 @@
         <w:pStyle w:val="ListBullet"/>
       </w:pPr>
       <w:r>
-        <w:t>Self illness: medical or health evidence relating to the applicant.</w:t>
+        <w:t>The system must verify only claimed evidence categories and avoid labelling unclaimed categories as positive.</w:t>
       </w:r>
     </w:p>
     <w:p>
@@ -257,7 +391,7 @@
         <w:pStyle w:val="ListBullet"/>
       </w:pPr>
       <w:r>
-        <w:t>Family illness: medical or health evidence relating to a spouse, child, parent, dependent, or other relevant family member.</w:t>
+        <w:t>The system must handle text PDFs and scanned image PDFs.</w:t>
       </w:r>
     </w:p>
     <w:p>
@@ -265,7 +399,7 @@
         <w:pStyle w:val="ListBullet"/>
       </w:pPr>
       <w:r>
-        <w:t>Spouse location: evidence of spouse workplace, posting, residence, or location relevant to placement.</w:t>
+        <w:t>The system must use page images and visual cues when OCR is weak.</w:t>
       </w:r>
     </w:p>
     <w:p>
@@ -273,7 +407,7 @@
         <w:pStyle w:val="ListBullet"/>
       </w:pPr>
       <w:r>
-        <w:t>OKU self or family: official OKU or disability evidence for the applicant or relevant family member.</w:t>
+        <w:t>The system must run locally where feasible, including local model inference.</w:t>
       </w:r>
     </w:p>
     <w:p>
@@ -281,7 +415,20 @@
         <w:pStyle w:val="ListBullet"/>
       </w:pPr>
       <w:r>
-        <w:t>MedEX or other examination: evidence of MedEX, postgraduate examination, specialist training examination, entrance examination, examination attendance, result, certificate, or official registration. Routine physical examination, general medical check-up, and generic medical reports were not treated as MedEX evidence.</w:t>
+        <w:t>The system must produce operator-facing outputs, not only machine labels.</w:t>
+      </w:r>
+    </w:p>
+    <w:p>
+      <w:pPr>
+        <w:pStyle w:val="ListBullet"/>
+      </w:pPr>
+      <w:r>
+        <w:t>The system must preserve original PDF links, page references, evidence summaries and proof-strength fields for audit.</w:t>
+      </w:r>
+    </w:p>
+    <w:p>
+      <w:r>
+        <w:t>These requirements shaped the architecture more than any single model choice.</w:t>
       </w:r>
     </w:p>
     <w:p>
@@ -289,78 +436,70 @@
         <w:pStyle w:val="Heading2"/>
       </w:pPr>
       <w:r>
-        <w:t>Index System</w:t>
+        <w:t>Evidence Categories and Claim Extraction</w:t>
       </w:r>
     </w:p>
     <w:p>
       <w:r>
-        <w:t>The evaluated system is a local-first verifier implemented as a Python application with a Streamlit operator interface, Langflow-shaped orchestration, local file-based inputs and outputs, and local model execution through Ollama. The relevant v4.1 workflow used a claim-guided design. It first parsed the applicant spreadsheet row into claimed evidence booleans, then verified only categories claimed by the applicant. Unclaimed categories were not treated as positive evidence targets.</w:t>
+        <w:t>The verifier mapped each applicant row into six boolean claims:</w:t>
+      </w:r>
+    </w:p>
+    <w:p>
+      <w:pPr>
+        <w:pStyle w:val="ListBullet"/>
+      </w:pPr>
+      <w:r>
+        <w:t>claimed_marriage</w:t>
+      </w:r>
+    </w:p>
+    <w:p>
+      <w:pPr>
+        <w:pStyle w:val="ListBullet"/>
+      </w:pPr>
+      <w:r>
+        <w:t>claimed_self_illness</w:t>
+      </w:r>
+    </w:p>
+    <w:p>
+      <w:pPr>
+        <w:pStyle w:val="ListBullet"/>
+      </w:pPr>
+      <w:r>
+        <w:t>claimed_family_illness</w:t>
+      </w:r>
+    </w:p>
+    <w:p>
+      <w:pPr>
+        <w:pStyle w:val="ListBullet"/>
+      </w:pPr>
+      <w:r>
+        <w:t>claimed_spouse_location</w:t>
+      </w:r>
+    </w:p>
+    <w:p>
+      <w:pPr>
+        <w:pStyle w:val="ListBullet"/>
+      </w:pPr>
+      <w:r>
+        <w:t>claimed_oku_self_or_family</w:t>
+      </w:r>
+    </w:p>
+    <w:p>
+      <w:pPr>
+        <w:pStyle w:val="ListBullet"/>
+      </w:pPr>
+      <w:r>
+        <w:t>claimed_medex_other_exam</w:t>
       </w:r>
     </w:p>
     <w:p>
       <w:r>
-        <w:t>The core processing path was:</w:t>
-      </w:r>
-    </w:p>
-    <w:p>
-      <w:pPr>
-        <w:pStyle w:val="ListNumber"/>
-      </w:pPr>
-      <w:r>
-        <w:t>Applicant spreadsheet ingestion and column normalisation.</w:t>
-      </w:r>
-    </w:p>
-    <w:p>
-      <w:pPr>
-        <w:pStyle w:val="ListNumber"/>
-      </w:pPr>
-      <w:r>
-        <w:t>Claim extraction from structured applicant fields.</w:t>
-      </w:r>
-    </w:p>
-    <w:p>
-      <w:pPr>
-        <w:pStyle w:val="ListNumber"/>
-      </w:pPr>
-      <w:r>
-        <w:t>Supporting PDF acquisition from the uploaded document link or local path.</w:t>
-      </w:r>
-    </w:p>
-    <w:p>
-      <w:pPr>
-        <w:pStyle w:val="ListNumber"/>
-      </w:pPr>
-      <w:r>
-        <w:t>PDF text extraction and page rendering.</w:t>
-      </w:r>
-    </w:p>
-    <w:p>
-      <w:pPr>
-        <w:pStyle w:val="ListNumber"/>
-      </w:pPr>
-      <w:r>
-        <w:t>OCR routing using direct PDF text where possible, with OCR fallback for scanned or low-text pages.</w:t>
-      </w:r>
-    </w:p>
-    <w:p>
-      <w:pPr>
-        <w:pStyle w:val="ListNumber"/>
-      </w:pPr>
-      <w:r>
-        <w:t>Claim-guided evidence signal generation using deterministic rules, OCR-derived signals, and local language/vision model support.</w:t>
-      </w:r>
-    </w:p>
-    <w:p>
-      <w:pPr>
-        <w:pStyle w:val="ListNumber"/>
-      </w:pPr>
-      <w:r>
-        <w:t>Export of decision queues, scoring sheets, final tick sheets, merged outputs, and audit fields.</w:t>
+        <w:t>Claim extraction used deterministic rules over normalised spreadsheet fields. For example, marital-status and spouse-related fields informed marriage and spouse-location claims; applicant health fields informed self-illness claims; spouse, child or parent health indicators informed family-illness claims; OKU-related fields informed disability claims; and postgraduate or examination fields informed MedEX or other examination claims. If a row contained contradictory or unclear structured evidence, the applicant was routed to manual review rather than silently interpreted.</w:t>
       </w:r>
     </w:p>
     <w:p>
       <w:r>
-        <w:t>Version 4.1 added proof-strength and page-level audit fields while preserving the v4 prediction labels and check-required flags. The validation workbook confirmed that v4.1 output was identical to v4 for predictions and check-required flags.</w:t>
+        <w:t>The six proof categories were intentionally practical rather than ontological. They reflect administrative review needs. Marriage proof could include marriage or nikah certificates and clear spouse relationship evidence. Self-illness proof required medical evidence about the applicant. Family-illness proof required medical evidence about a spouse, child, parent or relevant family member. Spouse-location proof required evidence of spouse workplace, posting, residence or location. OKU proof required explicit OKU or disability evidence. MedEX or other examination proof required examination registration, attendance, result, certificate or official postgraduate/specialist examination documentation; generic physical examination or routine medical notes were not sufficient.</w:t>
       </w:r>
     </w:p>
     <w:p>
@@ -368,12 +507,63 @@
         <w:pStyle w:val="Heading2"/>
       </w:pPr>
       <w:r>
-        <w:t>Reference Standard</w:t>
+        <w:t>Workflow Architecture</w:t>
       </w:r>
     </w:p>
     <w:p>
       <w:r>
-        <w:t>The reference standard was a manually validated dataset supplied as the final validation workbook. Manual validation classified each applicant-evidence category as present or absent. The analysis compared the algorithmic output against this manual reference standard across six evidence categories for each matched applicant.</w:t>
+        <w:t>The implemented workflow had seven stages. First, applicant spreadsheets were ingested and mapped to canonical columns. Second, claim extraction converted structured fields into the six claim booleans. Third, supporting PDFs were acquired from original uploaded links or local cached paths. Fourth, PDFs were processed through direct text extraction and page rendering. Fifth, OCR routing selected direct PDF text where available and OCR fallback for scanned or low-text pages. Sixth, the AI harness generated claim-specific evidence signals. Finally, export writers produced decision queues, scoring sheets, final tick sheets, merged outputs and audit payloads.</w:t>
+      </w:r>
+    </w:p>
+    <w:p>
+      <w:pPr>
+        <w:jc w:val="center"/>
+      </w:pPr>
+      <w:r>
+        <w:drawing>
+          <wp:inline xmlns:a="http://schemas.openxmlformats.org/drawingml/2006/main" xmlns:pic="http://schemas.openxmlformats.org/drawingml/2006/picture">
+            <wp:extent cx="6217920" cy="3649649"/>
+            <wp:docPr id="3" name="Picture 3"/>
+            <wp:cNvGraphicFramePr>
+              <a:graphicFrameLocks noChangeAspect="1"/>
+            </wp:cNvGraphicFramePr>
+            <a:graphic>
+              <a:graphicData uri="http://schemas.openxmlformats.org/drawingml/2006/picture">
+                <pic:pic>
+                  <pic:nvPicPr>
+                    <pic:cNvPr id="0" name="figure_3_workflow.png"/>
+                    <pic:cNvPicPr/>
+                  </pic:nvPicPr>
+                  <pic:blipFill>
+                    <a:blip r:embed="rId11"/>
+                    <a:stretch>
+                      <a:fillRect/>
+                    </a:stretch>
+                  </pic:blipFill>
+                  <pic:spPr>
+                    <a:xfrm>
+                      <a:off x="0" y="0"/>
+                      <a:ext cx="6217920" cy="3649649"/>
+                    </a:xfrm>
+                    <a:prstGeom prst="rect"/>
+                  </pic:spPr>
+                </pic:pic>
+              </a:graphicData>
+            </a:graphic>
+          </wp:inline>
+        </w:drawing>
+      </w:r>
+    </w:p>
+    <w:p>
+      <w:pPr>
+        <w:jc w:val="center"/>
+      </w:pPr>
+      <w:r>
+        <w:rPr>
+          <w:i/>
+          <w:sz w:val="18"/>
+        </w:rPr>
+        <w:t>Figure 3. Claim-guided document evidence workflow.</w:t>
       </w:r>
     </w:p>
     <w:p>
@@ -381,12 +571,17 @@
         <w:pStyle w:val="Heading2"/>
       </w:pPr>
       <w:r>
-        <w:t>Outcomes</w:t>
+        <w:t>OCR and Page Processing</w:t>
       </w:r>
     </w:p>
     <w:p>
       <w:r>
-        <w:t>The primary outcomes were evidence-level true positives, false positives, true negatives, and false negatives. From these counts, we calculated accuracy, sensitivity, specificity, PPV, NPV, and F1 score. Secondary outcomes included exact applicant-level match, defined as all six evidence-category predictions matching the manual reference standard for an applicant, and the proportion of applicants flagged for manual review.</w:t>
+        <w:t>The OCR design followed a direct-text-first principle. If a PDF contained sufficient extractable text, the system avoided unnecessary OCR. If direct text was absent, sparse or low quality, pages were rendered as images and routed through OCR. The OCR route could use Tesseract-style extraction for standard printed text and a PaddleOCR fallback for difficult pages. Page images were retained for downstream visual inspection by the model and the human reviewer.</w:t>
+      </w:r>
+    </w:p>
+    <w:p>
+      <w:r>
+        <w:t>The system also generated page-level metadata: page number, extracted text, OCR confidence where available, image path, candidate signals and matching keywords. This metadata served two purposes. First, it reduced unnecessary model calls by shortlisting likely pages. Second, it made the final output auditable because reviewers could see why a page was considered relevant.</w:t>
       </w:r>
     </w:p>
     <w:p>
@@ -394,12 +589,298 @@
         <w:pStyle w:val="Heading2"/>
       </w:pPr>
       <w:r>
-        <w:t>Statistical Analysis</w:t>
+        <w:t>AI Harness</w:t>
       </w:r>
     </w:p>
     <w:p>
       <w:r>
-        <w:t>We calculated decision-level performance metrics using standard 2 x 2 classification definitions. Because each applicant contributed six evidence-level observations, evidence-level metrics should be interpreted as clustered descriptive summaries rather than independent observations. Where confidence intervals are reported, they use approximate Wilson intervals and should be interpreted as descriptive. Future submission-ready analysis should use applicant-clustered bootstrap intervals.</w:t>
+        <w:t>The AI harness was the central methodological component. It was designed as a constrained verification layer rather than an unconstrained chatbot or free-form classifier. The harness included:</w:t>
+      </w:r>
+    </w:p>
+    <w:p>
+      <w:pPr>
+        <w:pStyle w:val="ListBullet"/>
+      </w:pPr>
+      <w:r>
+        <w:t>Langflow-shaped orchestration to make the processing chain inspectable and modular.</w:t>
+      </w:r>
+    </w:p>
+    <w:p>
+      <w:pPr>
+        <w:pStyle w:val="ListBullet"/>
+      </w:pPr>
+      <w:r>
+        <w:t>Deterministic claim extraction and skip logic for unclaimed categories.</w:t>
+      </w:r>
+    </w:p>
+    <w:p>
+      <w:pPr>
+        <w:pStyle w:val="ListBullet"/>
+      </w:pPr>
+      <w:r>
+        <w:t>OCR-derived page signals including keywords, names, identity numbers and layout hints.</w:t>
+      </w:r>
+    </w:p>
+    <w:p>
+      <w:pPr>
+        <w:pStyle w:val="ListBullet"/>
+      </w:pPr>
+      <w:r>
+        <w:t>Local multimodal inference through Ollama and Qwen2.5-VL for visually complex or OCR-poor pages.</w:t>
+      </w:r>
+    </w:p>
+    <w:p>
+      <w:pPr>
+        <w:pStyle w:val="ListBullet"/>
+      </w:pPr>
+      <w:r>
+        <w:t>Structured prompts that explicitly instructed the model not to classify the whole PDF and not to infer unclaimed categories.</w:t>
+      </w:r>
+    </w:p>
+    <w:p>
+      <w:pPr>
+        <w:pStyle w:val="ListBullet"/>
+      </w:pPr>
+      <w:r>
+        <w:t>JSON schema parsing to force outputs into proof_found, proof_strength, supporting_page, evidence_summary and confidence fields.</w:t>
+      </w:r>
+    </w:p>
+    <w:p>
+      <w:pPr>
+        <w:pStyle w:val="ListBullet"/>
+      </w:pPr>
+      <w:r>
+        <w:t>A decision policy that set check_required when proof was missing, ambiguous, low confidence or affected by process failure.</w:t>
+      </w:r>
+    </w:p>
+    <w:p>
+      <w:r>
+        <w:t>This design reflects a deliberate separation of responsibilities. The spreadsheet and rules layer defines what needs to be checked. OCR and rendering define what can be read or seen. The VLM adjudicates ambiguous visual evidence within a constrained prompt. The parser and decision policy translate model output into auditable structured fields. The operator interface then displays the result with a link to the original PDF.</w:t>
+      </w:r>
+    </w:p>
+    <w:p>
+      <w:pPr>
+        <w:jc w:val="center"/>
+      </w:pPr>
+      <w:r>
+        <w:drawing>
+          <wp:inline xmlns:a="http://schemas.openxmlformats.org/drawingml/2006/main" xmlns:pic="http://schemas.openxmlformats.org/drawingml/2006/picture">
+            <wp:extent cx="6217920" cy="3784821"/>
+            <wp:docPr id="4" name="Picture 4"/>
+            <wp:cNvGraphicFramePr>
+              <a:graphicFrameLocks noChangeAspect="1"/>
+            </wp:cNvGraphicFramePr>
+            <a:graphic>
+              <a:graphicData uri="http://schemas.openxmlformats.org/drawingml/2006/picture">
+                <pic:pic>
+                  <pic:nvPicPr>
+                    <pic:cNvPr id="0" name="figure_4_ai_harness.png"/>
+                    <pic:cNvPicPr/>
+                  </pic:nvPicPr>
+                  <pic:blipFill>
+                    <a:blip r:embed="rId12"/>
+                    <a:stretch>
+                      <a:fillRect/>
+                    </a:stretch>
+                  </pic:blipFill>
+                  <pic:spPr>
+                    <a:xfrm>
+                      <a:off x="0" y="0"/>
+                      <a:ext cx="6217920" cy="3784821"/>
+                    </a:xfrm>
+                    <a:prstGeom prst="rect"/>
+                  </pic:spPr>
+                </pic:pic>
+              </a:graphicData>
+            </a:graphic>
+          </wp:inline>
+        </w:drawing>
+      </w:r>
+    </w:p>
+    <w:p>
+      <w:pPr>
+        <w:jc w:val="center"/>
+      </w:pPr>
+      <w:r>
+        <w:rPr>
+          <w:i/>
+          <w:sz w:val="18"/>
+        </w:rPr>
+        <w:t>Figure 4. AI harness and local inference architecture.</w:t>
+      </w:r>
+    </w:p>
+    <w:p>
+      <w:pPr>
+        <w:pStyle w:val="Heading2"/>
+      </w:pPr>
+      <w:r>
+        <w:t>Claim-Guided Verification Logic</w:t>
+      </w:r>
+    </w:p>
+    <w:p>
+      <w:r>
+        <w:t>The final method differed from earlier broad classification in one essential way. It did not ask, "What documents are in this PDF?" It asked, "For the claims this applicant declared, does the uploaded PDF contain sufficient proof?" This is a smaller and more operationally meaningful question.</w:t>
+      </w:r>
+    </w:p>
+    <w:p>
+      <w:r>
+        <w:t>If an applicant did not claim a category, the verifier did not mark that category as proof_found even if the document contained something suggestive. If an applicant did claim a category, the verifier searched for sufficient proof and produced one of three practical states: supported, missing or ambiguous. Ambiguous and low-confidence outputs were routed to manual review. This design was intended to reduce false positives from unclaimed evidence while preserving a pathway for human judgement.</w:t>
+      </w:r>
+    </w:p>
+    <w:p>
+      <w:pPr>
+        <w:jc w:val="center"/>
+      </w:pPr>
+      <w:r>
+        <w:drawing>
+          <wp:inline xmlns:a="http://schemas.openxmlformats.org/drawingml/2006/main" xmlns:pic="http://schemas.openxmlformats.org/drawingml/2006/picture">
+            <wp:extent cx="6217920" cy="3532909"/>
+            <wp:docPr id="5" name="Picture 5"/>
+            <wp:cNvGraphicFramePr>
+              <a:graphicFrameLocks noChangeAspect="1"/>
+            </wp:cNvGraphicFramePr>
+            <a:graphic>
+              <a:graphicData uri="http://schemas.openxmlformats.org/drawingml/2006/picture">
+                <pic:pic>
+                  <pic:nvPicPr>
+                    <pic:cNvPr id="0" name="figure_5_method_shift.png"/>
+                    <pic:cNvPicPr/>
+                  </pic:nvPicPr>
+                  <pic:blipFill>
+                    <a:blip r:embed="rId13"/>
+                    <a:stretch>
+                      <a:fillRect/>
+                    </a:stretch>
+                  </pic:blipFill>
+                  <pic:spPr>
+                    <a:xfrm>
+                      <a:off x="0" y="0"/>
+                      <a:ext cx="6217920" cy="3532909"/>
+                    </a:xfrm>
+                    <a:prstGeom prst="rect"/>
+                  </pic:spPr>
+                </pic:pic>
+              </a:graphicData>
+            </a:graphic>
+          </wp:inline>
+        </w:drawing>
+      </w:r>
+    </w:p>
+    <w:p>
+      <w:pPr>
+        <w:jc w:val="center"/>
+      </w:pPr>
+      <w:r>
+        <w:rPr>
+          <w:i/>
+          <w:sz w:val="18"/>
+        </w:rPr>
+        <w:t>Figure 5. From broad classification to claim-guided proof verification.</w:t>
+      </w:r>
+    </w:p>
+    <w:p>
+      <w:pPr>
+        <w:pStyle w:val="Heading2"/>
+      </w:pPr>
+      <w:r>
+        <w:t>Outputs</w:t>
+      </w:r>
+    </w:p>
+    <w:p>
+      <w:r>
+        <w:t>The system produced several operator-facing artifacts:</w:t>
+      </w:r>
+    </w:p>
+    <w:p>
+      <w:pPr>
+        <w:pStyle w:val="ListBullet"/>
+      </w:pPr>
+      <w:r>
+        <w:t>A final tick sheet with one row per applicant and one column per evidence class.</w:t>
+      </w:r>
+    </w:p>
+    <w:p>
+      <w:pPr>
+        <w:pStyle w:val="ListBullet"/>
+      </w:pPr>
+      <w:r>
+        <w:t>A scoring sheet for manual validation and subsequent model comparison.</w:t>
+      </w:r>
+    </w:p>
+    <w:p>
+      <w:pPr>
+        <w:pStyle w:val="ListBullet"/>
+      </w:pPr>
+      <w:r>
+        <w:t>A decision queue indicating check or no-check status.</w:t>
+      </w:r>
+    </w:p>
+    <w:p>
+      <w:pPr>
+        <w:pStyle w:val="ListBullet"/>
+      </w:pPr>
+      <w:r>
+        <w:t>A review queue for applicants requiring manual inspection.</w:t>
+      </w:r>
+    </w:p>
+    <w:p>
+      <w:pPr>
+        <w:pStyle w:val="ListBullet"/>
+      </w:pPr>
+      <w:r>
+        <w:t>Supporting-page and evidence-summary fields.</w:t>
+      </w:r>
+    </w:p>
+    <w:p>
+      <w:pPr>
+        <w:pStyle w:val="ListBullet"/>
+      </w:pPr>
+      <w:r>
+        <w:t>Original PDF links for immediate click-through review.</w:t>
+      </w:r>
+    </w:p>
+    <w:p>
+      <w:pPr>
+        <w:pStyle w:val="ListBullet"/>
+      </w:pPr>
+      <w:r>
+        <w:t>Proof-strength and confidence fields for each claimed category.</w:t>
+      </w:r>
+    </w:p>
+    <w:p>
+      <w:r>
+        <w:t>These outputs were designed for workflow use. The system did not merely provide labels; it provided a structured review surface that could support manual checking, quality assurance and future recalibration.</w:t>
+      </w:r>
+    </w:p>
+    <w:p>
+      <w:pPr>
+        <w:pStyle w:val="Heading2"/>
+      </w:pPr>
+      <w:r>
+        <w:t>Validation Dataset</w:t>
+      </w:r>
+    </w:p>
+    <w:p>
+      <w:r>
+        <w:t>The final validation used a manually adjudicated reference workbook. The analytic set included 238 matched applicants. Each applicant contributed six applicant-evidence decisions, producing 1,428 binary decisions. Manual adjudication defined whether each evidence category was present or absent.</w:t>
+      </w:r>
+    </w:p>
+    <w:p>
+      <w:pPr>
+        <w:pStyle w:val="Heading2"/>
+      </w:pPr>
+      <w:r>
+        <w:t>Evaluation Metrics</w:t>
+      </w:r>
+    </w:p>
+    <w:p>
+      <w:r>
+        <w:t>We calculated true positives, false positives, true negatives and false negatives at the evidence-decision level. We then estimated accuracy, sensitivity, specificity, positive predictive value (PPV), negative predictive value (NPV) and F1 score. We also calculated exact applicant-level agreement, defined as all six evidence categories matching the manual reference standard for a given applicant. The manual review rate was calculated as the proportion of applicants routed to check.</w:t>
+      </w:r>
+    </w:p>
+    <w:p>
+      <w:r>
+        <w:t>Because each applicant contributed six correlated evidence decisions, the decision-level metrics should be interpreted as descriptive rather than fully independent observations. Approximate Wilson intervals were generated in the machine-readable validation summary, but the manuscript emphasises point estimates and operational interpretation. Future work should use applicant-clustered bootstrap intervals.</w:t>
       </w:r>
     </w:p>
     <w:p>
@@ -412,7 +893,7 @@
     </w:p>
     <w:p>
       <w:r>
-        <w:t>This manuscript draft is based on derived validation metrics and does not include raw applicant PDFs or identifiable applicant documents. The repository should continue to exclude raw applicant data, downloaded PDFs, OCR caches, local databases, and generated working files from version control. Formal ethics, data protection, and information governance statements should be added before external submission or operational deployment.</w:t>
+        <w:t>The development workflow intentionally avoided committing raw applicant PDFs, OCR caches, local databases or applicant-level error sheets to source control. The manuscript folder contains de-identified aggregate validation outputs only. Before operational deployment or external submission, the method should be accompanied by a data protection statement, access-control model, retention policy, model-governance note and reviewer accountability process.</w:t>
       </w:r>
     </w:p>
     <w:p>
@@ -428,12 +909,65 @@
         <w:pStyle w:val="Heading2"/>
       </w:pPr>
       <w:r>
-        <w:t>Validation Set</w:t>
+        <w:t>Developed System Artifact</w:t>
       </w:r>
     </w:p>
     <w:p>
       <w:r>
-        <w:t>The validation set included 238 matched applicants. Since each applicant was evaluated across six evidence categories, the total number of evidence-level binary decisions was 1,428.</w:t>
+        <w:t>The final artifact was a local-first, claim-guided verifier that could ingest applicant data, retrieve uploaded PDFs, process text and image documents, invoke a constrained local VLM, and export audit-ready review outputs. The main development result was not a black-box model but a repeatable workflow that converted applicant-declared claims into proof-checking tasks.</w:t>
+      </w:r>
+    </w:p>
+    <w:p>
+      <w:r>
+        <w:t>The verifier operationalised six design levers:</w:t>
+      </w:r>
+    </w:p>
+    <w:p>
+      <w:pPr>
+        <w:pStyle w:val="ListBullet"/>
+      </w:pPr>
+      <w:r>
+        <w:t>Claim primacy: structured applicant claims define what the system checks.</w:t>
+      </w:r>
+    </w:p>
+    <w:p>
+      <w:pPr>
+        <w:pStyle w:val="ListBullet"/>
+      </w:pPr>
+      <w:r>
+        <w:t>Category skipping: unclaimed categories are not labelled as positive evidence.</w:t>
+      </w:r>
+    </w:p>
+    <w:p>
+      <w:pPr>
+        <w:pStyle w:val="ListBullet"/>
+      </w:pPr>
+      <w:r>
+        <w:t>OCR-aware perception: direct text, OCR and page images are combined rather than treated as interchangeable.</w:t>
+      </w:r>
+    </w:p>
+    <w:p>
+      <w:pPr>
+        <w:pStyle w:val="ListBullet"/>
+      </w:pPr>
+      <w:r>
+        <w:t>Constrained local VLM inference: the model is prompted with claim context and forced into structured outputs.</w:t>
+      </w:r>
+    </w:p>
+    <w:p>
+      <w:pPr>
+        <w:pStyle w:val="ListBullet"/>
+      </w:pPr>
+      <w:r>
+        <w:t>Proof-strength adjudication: evidence is represented as strength and support, not only present or absent.</w:t>
+      </w:r>
+    </w:p>
+    <w:p>
+      <w:pPr>
+        <w:pStyle w:val="ListBullet"/>
+      </w:pPr>
+      <w:r>
+        <w:t>Human-in-the-loop export: outputs are built for review, validation and recalibration.</w:t>
       </w:r>
     </w:p>
     <w:p>
@@ -441,12 +975,12 @@
         <w:pStyle w:val="Heading2"/>
       </w:pPr>
       <w:r>
-        <w:t>Overall Evidence-Level Performance</w:t>
+        <w:t>Validation Set and Overall Performance</w:t>
       </w:r>
     </w:p>
     <w:p>
       <w:r>
-        <w:t>The verifier produced 415 true positives, 103 false positives, 856 true negatives, and 54 false negatives. Overall decision-level accuracy was 89.0%. Sensitivity was 88.5%, indicating that most manually confirmed evidence-positive categories were detected by the system. Specificity was 89.3%, indicating good discrimination among evidence-negative categories. PPV was 80.1%, NPV was 94.1%, and F1 score was 84.1%.</w:t>
+        <w:t>The validation set included 238 applicants and 1,428 evidence-level decisions. The verifier produced 415 true positives, 103 false positives, 856 true negatives and 54 false negatives. Overall accuracy was 89.0%, sensitivity 88.5%, specificity 89.3%, PPV 80.1%, NPV 94.1% and F1 score 84.1%.</w:t>
       </w:r>
     </w:p>
     <w:tbl>
@@ -872,17 +1406,17 @@
         <w:pStyle w:val="Heading2"/>
       </w:pPr>
       <w:r>
-        <w:t>Performance by Evidence Type</w:t>
+        <w:t>Evidence-Type Performance</w:t>
       </w:r>
     </w:p>
     <w:p>
       <w:r>
-        <w:t>Performance varied materially by evidence type. Marriage evidence performed strongly, with sensitivity of 88.8%, specificity of 98.9%, PPV of 99.2%, and F1 score of 93.7%. MedEX or other examination evidence also performed well, with sensitivity of 91.4%, specificity of 87.9%, PPV of 79.6%, and F1 score of 85.1%.</w:t>
+        <w:t>Performance varied by evidence category. Marriage evidence performed strongly, with sensitivity of 88.8%, specificity of 98.9%, PPV of 99.2% and F1 score of 93.7%. MedEX or other examination evidence also performed well, with sensitivity of 91.4%, specificity of 87.9% and F1 score of 85.1%. These categories have relatively distinctive document forms or vocabulary.</w:t>
       </w:r>
     </w:p>
     <w:p>
       <w:r>
-        <w:t>The most difficult categories were family illness and spouse location. Family illness achieved sensitivity of 83.9% but specificity of 69.5%, with 46 false positives. Spouse location achieved very high sensitivity of 98.1%, but specificity was 75.4%, with 32 false positives. This pattern suggests that the system was tuned toward recall for relational evidence, but at the cost of over-calling some family or spouse-location documents.</w:t>
+        <w:t>Family illness and spouse-location evidence were more difficult. Family illness had sensitivity of 83.9% but specificity of 69.5%, while spouse location had sensitivity of 98.1% and specificity of 75.4%. This pattern suggests that the verifier was effective at detecting possible relational evidence, but sometimes over-called documents where the relationship or purpose of the document was not sufficiently clear.</w:t>
       </w:r>
     </w:p>
     <w:tbl>
@@ -2223,20 +2757,66 @@
     <w:p/>
     <w:p>
       <w:pPr>
+        <w:jc w:val="center"/>
+      </w:pPr>
+      <w:r>
+        <w:drawing>
+          <wp:inline xmlns:a="http://schemas.openxmlformats.org/drawingml/2006/main" xmlns:pic="http://schemas.openxmlformats.org/drawingml/2006/picture">
+            <wp:extent cx="6217920" cy="4055165"/>
+            <wp:docPr id="6" name="Picture 6"/>
+            <wp:cNvGraphicFramePr>
+              <a:graphicFrameLocks noChangeAspect="1"/>
+            </wp:cNvGraphicFramePr>
+            <a:graphic>
+              <a:graphicData uri="http://schemas.openxmlformats.org/drawingml/2006/picture">
+                <pic:pic>
+                  <pic:nvPicPr>
+                    <pic:cNvPr id="0" name="figure_6_performance_by_evidence.png"/>
+                    <pic:cNvPicPr/>
+                  </pic:nvPicPr>
+                  <pic:blipFill>
+                    <a:blip r:embed="rId14"/>
+                    <a:stretch>
+                      <a:fillRect/>
+                    </a:stretch>
+                  </pic:blipFill>
+                  <pic:spPr>
+                    <a:xfrm>
+                      <a:off x="0" y="0"/>
+                      <a:ext cx="6217920" cy="4055165"/>
+                    </a:xfrm>
+                    <a:prstGeom prst="rect"/>
+                  </pic:spPr>
+                </pic:pic>
+              </a:graphicData>
+            </a:graphic>
+          </wp:inline>
+        </w:drawing>
+      </w:r>
+    </w:p>
+    <w:p>
+      <w:pPr>
+        <w:jc w:val="center"/>
+      </w:pPr>
+      <w:r>
+        <w:rPr>
+          <w:i/>
+          <w:sz w:val="18"/>
+        </w:rPr>
+        <w:t>Figure 6. Evidence-type-specific performance.</w:t>
+      </w:r>
+    </w:p>
+    <w:p>
+      <w:pPr>
         <w:pStyle w:val="Heading2"/>
       </w:pPr>
       <w:r>
-        <w:t>Applicant-Level Agreement and Review Burden</w:t>
+        <w:t>Manual Review Burden</w:t>
       </w:r>
     </w:p>
     <w:p>
       <w:r>
-        <w:t>Exact applicant-level agreement was 118/238 (49.6%). This is a stricter outcome than evidence-level accuracy because all six evidence categories had to match the manual reference standard for a given applicant. In operational terms, the system flagged 64/238 applicants for manual review, leaving 174/238 applicants not flagged. This corresponds to a potential 73.1% reduction in first-pass manual review workload if the system were used as an initial triage layer.</w:t>
-      </w:r>
-    </w:p>
-    <w:p>
-      <w:r>
-        <w:t>However, the review flag was not a complete detector of residual classification error. Among 120 applicants with at least one evidence-level error, 34 were flagged for review. Among 48 applicants with at least one false negative, 25 were flagged. These findings mean that "no_check" should not be interpreted as a guarantee of perfect classification. Rather, it reflects the system's current operational threshold for uncertainty or missing proof.</w:t>
+        <w:t>The verifier flagged 64 of 238 applicants for manual review, a review rate of 26.9%. Operationally, this means the system could separate a large no-check stream from a smaller targeted review stream. However, the review flag was not a complete detector of residual error. Among applicants with at least one evidence-level error, 34 of 120 were flagged. Among applicants with at least one false negative, 25 of 48 were flagged.</w:t>
       </w:r>
     </w:p>
     <w:tbl>
@@ -2624,15 +3204,66 @@
     <w:p/>
     <w:p>
       <w:pPr>
+        <w:jc w:val="center"/>
+      </w:pPr>
+      <w:r>
+        <w:drawing>
+          <wp:inline xmlns:a="http://schemas.openxmlformats.org/drawingml/2006/main" xmlns:pic="http://schemas.openxmlformats.org/drawingml/2006/picture">
+            <wp:extent cx="6217920" cy="3532909"/>
+            <wp:docPr id="7" name="Picture 7"/>
+            <wp:cNvGraphicFramePr>
+              <a:graphicFrameLocks noChangeAspect="1"/>
+            </wp:cNvGraphicFramePr>
+            <a:graphic>
+              <a:graphicData uri="http://schemas.openxmlformats.org/drawingml/2006/picture">
+                <pic:pic>
+                  <pic:nvPicPr>
+                    <pic:cNvPr id="0" name="figure_7_review_funnel.png"/>
+                    <pic:cNvPicPr/>
+                  </pic:nvPicPr>
+                  <pic:blipFill>
+                    <a:blip r:embed="rId15"/>
+                    <a:stretch>
+                      <a:fillRect/>
+                    </a:stretch>
+                  </pic:blipFill>
+                  <pic:spPr>
+                    <a:xfrm>
+                      <a:off x="0" y="0"/>
+                      <a:ext cx="6217920" cy="3532909"/>
+                    </a:xfrm>
+                    <a:prstGeom prst="rect"/>
+                  </pic:spPr>
+                </pic:pic>
+              </a:graphicData>
+            </a:graphic>
+          </wp:inline>
+        </w:drawing>
+      </w:r>
+    </w:p>
+    <w:p>
+      <w:pPr>
+        <w:jc w:val="center"/>
+      </w:pPr>
+      <w:r>
+        <w:rPr>
+          <w:i/>
+          <w:sz w:val="18"/>
+        </w:rPr>
+        <w:t>Figure 7. Human-in-the-loop review burden and residual error visibility.</w:t>
+      </w:r>
+    </w:p>
+    <w:p>
+      <w:pPr>
         <w:pStyle w:val="Heading2"/>
       </w:pPr>
       <w:r>
-        <w:t>Comparison With Version 4</w:t>
+        <w:t>Applicant-Level Agreement</w:t>
       </w:r>
     </w:p>
     <w:p>
       <w:r>
-        <w:t>The final validation workbook reported no prediction-label differences between v4 and v4.1, and no check-required differences. Thus, v4.1 should be interpreted as an auditability and reporting extension of v4 rather than a new predictive model. The practical value of v4.1 is the addition of proof-strength and supporting audit fields that make manual review more structured.</w:t>
+        <w:t>Exact applicant-level agreement was 118/238 (49.6%). This is stricter than evidence-level accuracy because all six evidence categories must match the reference standard for the applicant. In a multi-label administrative task, this metric is useful because it reflects the operator's experience: an applicant record can still require attention if even one relevant category is wrong. The difference between high evidence-level accuracy and moderate exact applicant-level agreement reinforces the need for ongoing review sampling and evidence-type-specific recalibration.</w:t>
       </w:r>
     </w:p>
     <w:p>
@@ -2653,12 +3284,12 @@
     </w:p>
     <w:p>
       <w:r>
-        <w:t>This validation showed that a local-first, claim-guided evidence verifier can achieve useful decision-level performance in a difficult administrative document setting. Across 1,428 evidence-level decisions, the system achieved sensitivity of 88.5%, specificity of 89.3%, NPV of 94.1%, and F1 score of 84.1%. It also reduced the first-pass manual review queue to 26.9% of applicants. These findings are consistent with a viable AI-assisted triage role.</w:t>
+        <w:t>We developed and evaluated a claim-guided, local-first document evidence verifier for public-sector human-resource applications. The method achieved 89.0% evidence-level accuracy and reduced the manual review queue to 26.9% of applicants in the validation set. More importantly, it demonstrated a workable architecture for a difficult administrative AI problem: reading applicant claims, inspecting heterogeneous document evidence, using local multimodal inference only within a constrained harness, and exporting evidence summaries for human review.</w:t>
       </w:r>
     </w:p>
     <w:p>
       <w:r>
-        <w:t>The results also show why the system should not be treated as autonomous adjudication. Exact applicant-level agreement was 49.6%, and the manual review flag captured only a subset of applicants with residual evidence-level errors. This is not unusual for multi-label document evidence systems, where each applicant contributes several opportunities for disagreement. However, it matters operationally because a low review rate can hide residual errors if thresholds are not calibrated to the governance objective.</w:t>
+        <w:t>The development finding is that workflow design matters as much as model choice. Early broad-classification logic treated the PDF as the primary object. The final method treated the applicant claim as the primary object. This changed the behaviour of the system. It reduced the incentive to label every plausible document and made the verifier more aligned with the administrative task: "Did the applicant upload proof for what they claimed?"</w:t>
       </w:r>
     </w:p>
     <w:p>
@@ -2666,17 +3297,17 @@
         <w:pStyle w:val="Heading2"/>
       </w:pPr>
       <w:r>
-        <w:t>Interpretation</w:t>
+        <w:t>The Harness Is the Method</w:t>
       </w:r>
     </w:p>
     <w:p>
       <w:r>
-        <w:t>The strongest categories were marriage and MedEX or other examination evidence. Marriage evidence benefited from relatively distinctive document structure and vocabulary, while MedEX and examination evidence became easier after earlier prompt and rule changes that separated official examination evidence from generic medical records. In contrast, family illness and spouse location were more ambiguous. Both categories depend on relational context: the document must not only be a medical or location document, but must also relate to the applicant, spouse, parent, child, or other relevant family member. This creates more room for over-calling when documents contain names, official letters, workplace references, or medical terms without a clearly adjudicable relationship.</w:t>
+        <w:t>The AI component is often described as if the model is the intervention. In this study, the harness is the intervention. The local VLM contributed visual reasoning, especially for OCR-poor evidence, but the model was surrounded by deterministic claim extraction, prompt constraints, OCR-derived signals, JSON schema enforcement, proof-strength rules, caching and manual-review triggers. This is the difference between using an LLM as a general document reader and deploying an AI-assisted evidence verifier.</w:t>
       </w:r>
     </w:p>
     <w:p>
       <w:r>
-        <w:t>The findings support a systems interpretation rather than a model-centric one. The improvement appears to come from the workflow design: using the applicant's declared claims, skipping unclaimed categories, combining OCR with vision-capable local model support, and exporting audit fields for review. The model is only one part of the system. The surrounding data model, column mapping, document acquisition, OCR routing, and decision queue design are equally important.</w:t>
+        <w:t>This design aligns with broader AI reporting guidance. DECIDE-AI emphasises human-AI interaction and early-stage workflow evaluation [16]. TRIPOD+AI and CONSORT-AI similarly stress transparent reporting of the AI component, input data and deployment context [17,18]. For administrative evidence verification, the same principles apply: the relevant object is not only the model's raw prediction, but the complete sociotechnical pathway from input data to human action.</w:t>
       </w:r>
     </w:p>
     <w:p>
@@ -2684,12 +3315,35 @@
         <w:pStyle w:val="Heading2"/>
       </w:pPr>
       <w:r>
-        <w:t>Operational Implications</w:t>
+        <w:t>Interpretation of Performance</w:t>
       </w:r>
     </w:p>
     <w:p>
       <w:r>
-        <w:t>For an ePlacement workflow, the most defensible near-term deployment is human-in-the-loop triage. A 26.9% review queue could materially reduce routine document review if no-check applicants are handled through an auditable first-pass process. However, production use should include safeguards:</w:t>
+        <w:t>The verifier performed best when documents had distinctive structure or vocabulary. Marriage certificates and examination-related documents often contain recognisable titles, official forms, registration numbers, candidate names, examination terms or certificates. The model and rules could therefore converge on the same signal.</w:t>
+      </w:r>
+    </w:p>
+    <w:p>
+      <w:r>
+        <w:t>The hardest categories were relational. Family illness requires the system to decide not only whether a document is medical, but whose medical evidence it is and whether that person is related to the applicant. Spouse location requires the system to separate spouse workplace or posting evidence from generic letters, applicant workplace documents or unrelated administrative correspondence. These categories are not only OCR problems; they are relationship-resolution problems. Future improvements should therefore focus on relational extraction, name matching, spouse and dependent linkage, and stricter evidence summaries for ambiguous third-person documents.</w:t>
+      </w:r>
+    </w:p>
+    <w:p>
+      <w:pPr>
+        <w:pStyle w:val="Heading2"/>
+      </w:pPr>
+      <w:r>
+        <w:t>Operational Use</w:t>
+      </w:r>
+    </w:p>
+    <w:p>
+      <w:r>
+        <w:t>The appropriate deployment model is AI-assisted triage. The system can reduce repetitive review and produce a structured queue, but it should not issue autonomous adverse decisions. A no-check result should mean "sufficient first-pass evidence found under current rules", not "human review is never needed". A check result should mean "operator attention is required because evidence is missing, ambiguous, low confidence or affected by process failure".</w:t>
+      </w:r>
+    </w:p>
+    <w:p>
+      <w:r>
+        <w:t>Recommended deployment safeguards include:</w:t>
       </w:r>
     </w:p>
     <w:p>
@@ -2697,7 +3351,7 @@
         <w:pStyle w:val="ListBullet"/>
       </w:pPr>
       <w:r>
-        <w:t>Review all applicants flagged as check or missing proof.</w:t>
+        <w:t>mandatory review of all check records;</w:t>
       </w:r>
     </w:p>
     <w:p>
@@ -2705,7 +3359,7 @@
         <w:pStyle w:val="ListBullet"/>
       </w:pPr>
       <w:r>
-        <w:t>Apply targeted review or sampling to no-check applicants, especially for family illness and spouse-location claims.</w:t>
+        <w:t>random sampling of no-check records;</w:t>
       </w:r>
     </w:p>
     <w:p>
@@ -2713,7 +3367,7 @@
         <w:pStyle w:val="ListBullet"/>
       </w:pPr>
       <w:r>
-        <w:t>Monitor false positives and false negatives by evidence type after each batch.</w:t>
+        <w:t>batch-level monitoring of sensitivity, specificity and review rate;</w:t>
       </w:r>
     </w:p>
     <w:p>
@@ -2721,7 +3375,7 @@
         <w:pStyle w:val="ListBullet"/>
       </w:pPr>
       <w:r>
-        <w:t>Preserve original PDF links, supporting pages, proof-strength fields, and evidence summaries for audit.</w:t>
+        <w:t>evidence-type-specific recalibration, especially for family illness and spouse location;</w:t>
       </w:r>
     </w:p>
     <w:p>
@@ -2729,7 +3383,7 @@
         <w:pStyle w:val="ListBullet"/>
       </w:pPr>
       <w:r>
-        <w:t>Recalibrate the check threshold based on operational tolerance for missed evidence versus manual workload.</w:t>
+        <w:t>preservation of original PDF links and supporting pages;</w:t>
       </w:r>
     </w:p>
     <w:p>
@@ -2737,12 +3391,7 @@
         <w:pStyle w:val="ListBullet"/>
       </w:pPr>
       <w:r>
-        <w:t>Avoid using the system as the sole basis for adverse decisions until external validation and governance review are complete.</w:t>
-      </w:r>
-    </w:p>
-    <w:p>
-      <w:r>
-        <w:t>The system's local-first architecture is important in the Malaysian public-sector context. Running OCR, document processing, and model inference locally can support data minimisation, lower external dependency, and clearer auditability. This is especially relevant when raw PDFs may contain health, disability, family, marital, and employment information.</w:t>
+        <w:t>separate governance for any future move from triage to decision automation.</w:t>
       </w:r>
     </w:p>
     <w:p>
@@ -2750,17 +3399,17 @@
         <w:pStyle w:val="Heading2"/>
       </w:pPr>
       <w:r>
-        <w:t>Relationship to the Broader e-KYC Landscape</w:t>
+        <w:t>Comparison With Full e-KYC Systems</w:t>
       </w:r>
     </w:p>
     <w:p>
       <w:r>
-        <w:t>This system should not be positioned as a complete e-KYC product. It does not currently perform identity document authenticity checks, face matching, liveness detection, NFC or eMRTD chip verification, sanctions screening, device-risk assessment, or financial crime risk scoring. Instead, it addresses a narrower but underexplored problem: evidence verification for administrative claims using local documents and a human-review workflow.</w:t>
+        <w:t>The system should not be described as full e-KYC. It does not perform identity document authenticity checks, biometric face matching, liveness detection, NFC or eMRTD chip verification, sanctions screening, device-risk assessment or financial-crime risk scoring. Standards and guidance from FATF, NIST and ICAO are important comparators for digital identity assurance [3-5], but they define a broader assurance stack than this method implements.</w:t>
       </w:r>
     </w:p>
     <w:p>
       <w:r>
-        <w:t>The broader literature and industry landscape suggest useful extension paths. Public identity-document datasets such as MIDV-500 and MIDV-2020 support document recognition and OCR benchmarking. Document AI models such as TrOCR, LayoutLMv3, Donut, and GeoLayoutLM provide candidate baselines for OCR-dependent and OCR-free document understanding. Document recapture and authenticity datasets such as DLC-2021, and broader identity-verification work on selfie-to-ID matching and presentation attack detection, are relevant if the system evolves toward full e-KYC. For the current manuscript, however, the honest contribution is an evaluated local-first evidence triage system, not a comprehensive identity proofing stack.</w:t>
+        <w:t>The contribution here is narrower and useful: a transparent, local-first proof-checking workflow for administrative claims. That narrowness is a strength if stated clearly. It allows the method to be evaluated on the task it was built for, rather than judged against an unrelated identity-proofing endpoint.</w:t>
       </w:r>
     </w:p>
     <w:p>
@@ -2773,7 +3422,7 @@
     </w:p>
     <w:p>
       <w:r>
-        <w:t>This validation has several strengths. First, it used a manually adjudicated validation set rather than relying only on synthetic examples or internal unit tests. Second, it evaluated six evidence categories that reflect the real administrative burden of ePlacement review. Third, it reported both evidence-level metrics and applicant-level exact agreement, which prevents overinterpretation of aggregate accuracy. Fourth, the system exported structured scoring and audit outputs, making future validation, error review, and recalibration feasible.</w:t>
+        <w:t>This study has four strengths. First, it reports a functioning software method rather than a conceptual prototype. Second, it evaluates the method against a manually adjudicated reference set. Third, it reports both evidence-level and applicant-level performance, preventing overinterpretation of aggregate accuracy. Fourth, it preserves operational outputs such as tick sheets, scoring sheets, original links and proof summaries, which makes future quality improvement possible.</w:t>
       </w:r>
     </w:p>
     <w:p>
@@ -2786,7 +3435,7 @@
     </w:p>
     <w:p>
       <w:r>
-        <w:t>The validation has important limitations. The dataset included 238 applicants from a single workflow and may not represent future application cycles, different document submission behaviours, or different scanner and language distributions. The reference standard depends on manual adjudication and may contain reviewer error. Evidence-level metrics treat six decisions per applicant as separate observations; future analysis should use applicant-clustered confidence intervals or bootstrap methods. The system does not verify document authenticity, liveness, or applicant identity. The review flag is not yet calibrated as a safety net for all residual errors. Finally, v4.1 did not improve prediction labels over v4; its contribution was auditability, proof-strength reporting, and more interpretable outputs.</w:t>
+        <w:t>The validation set included 238 applicants from one administrative workflow. Performance may differ in future application cycles, other document mixes, other languages, poorer scans or different applicant behaviours. The manual reference standard may contain adjudication error. Evidence-level decisions are clustered within applicants, so conventional decision-level metrics understate uncertainty. The system does not authenticate documents, verify identity or detect deliberate forgery. Finally, the current review flag does not catch every residual error and should be treated as a workload control rather than a safety guarantee.</w:t>
       </w:r>
     </w:p>
     <w:p>
@@ -2799,63 +3448,7 @@
     </w:p>
     <w:p>
       <w:r>
-        <w:t>The next development phase should focus on calibration and evidence-type-specific error reduction rather than broad model replacement. High-yield improvements include:</w:t>
-      </w:r>
-    </w:p>
-    <w:p>
-      <w:pPr>
-        <w:pStyle w:val="ListBullet"/>
-      </w:pPr>
-      <w:r>
-        <w:t>Recalibrating review thresholds to improve capture of false negatives while keeping manual review workload acceptable.</w:t>
-      </w:r>
-    </w:p>
-    <w:p>
-      <w:pPr>
-        <w:pStyle w:val="ListBullet"/>
-      </w:pPr>
-      <w:r>
-        <w:t>Adding active-learning loops from the manual scoring sheet into prompt, rule, and threshold updates.</w:t>
-      </w:r>
-    </w:p>
-    <w:p>
-      <w:pPr>
-        <w:pStyle w:val="ListBullet"/>
-      </w:pPr>
-      <w:r>
-        <w:t>Performing targeted error review for family illness and spouse-location false positives.</w:t>
-      </w:r>
-    </w:p>
-    <w:p>
-      <w:pPr>
-        <w:pStyle w:val="ListBullet"/>
-      </w:pPr>
-      <w:r>
-        <w:t>Adding applicant-clustered bootstrap confidence intervals and batch-level monitoring dashboards.</w:t>
-      </w:r>
-    </w:p>
-    <w:p>
-      <w:pPr>
-        <w:pStyle w:val="ListBullet"/>
-      </w:pPr>
-      <w:r>
-        <w:t>Benchmarking OCR and vision pathways against OCR-free document understanding baselines.</w:t>
-      </w:r>
-    </w:p>
-    <w:p>
-      <w:pPr>
-        <w:pStyle w:val="ListBullet"/>
-      </w:pPr>
-      <w:r>
-        <w:t>Testing robustness across language scripts, document quality, scanned image resolution, and multi-document PDF bundles.</w:t>
-      </w:r>
-    </w:p>
-    <w:p>
-      <w:pPr>
-        <w:pStyle w:val="ListBullet"/>
-      </w:pPr>
-      <w:r>
-        <w:t>Adding formal model cards, data protection impact assessment notes, and deployment governance documentation.</w:t>
+        <w:t>Future work should focus on improving relational evidence resolution and governance-readiness. High-yield technical extensions include better spouse and dependent linkage, stronger name and identity-number matching, explicit page-level relation extraction, OCR-free document understanding baselines such as Donut-style models, and systematic comparison of local VLMs. Operational extensions should include drift monitoring, reviewer feedback loops, active-learning queues, calibration dashboards and a model card. Governance work should define data retention, access control, appeal pathways, audit sampling and accountability for human-AI review.</w:t>
       </w:r>
     </w:p>
     <w:p>
@@ -2868,7 +3461,7 @@
     </w:p>
     <w:p>
       <w:r>
-        <w:t>The eplacement-kyc-verifier v4.1 system achieved strong evidence-level validation performance and reduced the first-pass manual review queue to 26.9% of applicants in a 238-applicant validation set. Its most appropriate role is AI-assisted administrative evidence triage, not autonomous KYC adjudication. The findings support continued development of local-first, auditable document evidence systems for public-sector workflows, provided that deployment includes structured manual review, residual error monitoring, and clear governance boundaries.</w:t>
+        <w:t>We developed and evaluated a local-first, claim-guided AI-assisted document evidence verifier for public-sector human-resource applications. The method converts structured applicant claims into targeted proof-checking tasks, combines OCR and page-image processing with constrained local VLM inference, and exports auditable outputs for human review. In a 238-applicant validation set, the verifier achieved strong evidence-level performance and reduced the manual review queue to 26.9%. The method is best understood as administrative decision support: a way to make proof checking faster, more consistent and more inspectable, while retaining human accountability for uncertain or consequential cases.</w:t>
       </w:r>
     </w:p>
     <w:p>
@@ -2876,12 +3469,12 @@
         <w:pStyle w:val="Heading1"/>
       </w:pPr>
       <w:r>
-        <w:t>Figure 1. System Schematic</w:t>
+        <w:t>Data and Code Availability</w:t>
       </w:r>
     </w:p>
     <w:p>
       <w:r>
-        <w:t>Applicant spreadsheet -&gt; claim extraction -&gt; PDF acquisition -&gt; direct text extraction and OCR routing -&gt; claim-guided evidence verification -&gt; decision queue, scoring sheet, final tick sheet, and audit exports.</w:t>
+        <w:t>Aggregate validation tables, manuscript source and the manuscript builder are stored in the repository manuscript folder. Raw applicant PDFs, OCR caches, local databases and applicant-level identifiable error sheets are not committed and should remain subject to organisational governance and privacy controls.</w:t>
       </w:r>
     </w:p>
     <w:p>
@@ -2889,66 +3482,12 @@
         <w:pStyle w:val="Heading1"/>
       </w:pPr>
       <w:r>
-        <w:t>Manuscript-Ready Table Captions</w:t>
+        <w:t>Author Contributions</w:t>
       </w:r>
     </w:p>
     <w:p>
       <w:r>
-        <w:t>Table 1. Overall validation performance of the eplacement-kyc-verifier v4.1 algorithm across 1,428 evidence-level binary decisions from 238 applicants.</w:t>
-      </w:r>
-    </w:p>
-    <w:p>
-      <w:r>
-        <w:t>Table 2a. Evidence-type-specific validation counts across six administrative evidence categories.</w:t>
-      </w:r>
-    </w:p>
-    <w:p>
-      <w:r>
-        <w:t>Table 2b. Evidence-type-specific validation performance across six administrative evidence categories.</w:t>
-      </w:r>
-    </w:p>
-    <w:p>
-      <w:r>
-        <w:t>Table 3. Manual review flag behaviour among false-positive decisions, false-negative decisions, applicants with residual errors, and all applicants.</w:t>
-      </w:r>
-    </w:p>
-    <w:p>
-      <w:pPr>
-        <w:pStyle w:val="Heading1"/>
-      </w:pPr>
-      <w:r>
-        <w:t>Data Availability</w:t>
-      </w:r>
-    </w:p>
-    <w:p>
-      <w:r>
-        <w:t>This draft uses derived validation metrics from `C:/Users/vivek/Downloads/eplacement_kyc_validation_analysis_v4_1.xlsx`. Raw applicant PDFs and identifiable applicant-level source data should not be committed to the repository. A de-identified validation summary and manuscript source are stored in this manuscript folder.</w:t>
-      </w:r>
-    </w:p>
-    <w:p>
-      <w:pPr>
-        <w:pStyle w:val="Heading1"/>
-      </w:pPr>
-      <w:r>
-        <w:t>Ethics and Governance Statement</w:t>
-      </w:r>
-    </w:p>
-    <w:p>
-      <w:r>
-        <w:t>This is a draft statement only. The final manuscript should specify whether the work was conducted as service evaluation, quality improvement, operational validation, or research requiring ethics review. It should also document data minimisation, access controls, retention policy, and whether any identifiable data were processed during algorithm development or validation.</w:t>
-      </w:r>
-    </w:p>
-    <w:p>
-      <w:pPr>
-        <w:pStyle w:val="Heading1"/>
-      </w:pPr>
-      <w:r>
-        <w:t>Competing Interests</w:t>
-      </w:r>
-    </w:p>
-    <w:p>
-      <w:r>
-        <w:t>To be completed before submission.</w:t>
+        <w:t>VJJ: conceptualisation, methodology, software, formal analysis, validation interpretation, writing - original draft. Additional collaborators: data curation, manual validation, governance review, writing - review and editing. To be completed before submission.</w:t>
       </w:r>
     </w:p>
     <w:p>
@@ -2969,7 +3508,20 @@
         <w:pStyle w:val="Heading1"/>
       </w:pPr>
       <w:r>
-        <w:t>References for Draft Development</w:t>
+        <w:t>Conflicts of Interest</w:t>
+      </w:r>
+    </w:p>
+    <w:p>
+      <w:r>
+        <w:t>The authors declare no competing interests. To be confirmed before submission.</w:t>
+      </w:r>
+    </w:p>
+    <w:p>
+      <w:pPr>
+        <w:pStyle w:val="Heading1"/>
+      </w:pPr>
+      <w:r>
+        <w:t>References</w:t>
       </w:r>
     </w:p>
     <w:p>
@@ -2977,7 +3529,7 @@
         <w:pStyle w:val="ListNumber"/>
       </w:pPr>
       <w:r>
-        <w:t>Financial Action Task Force. Guidance on Digital Identity.</w:t>
+        <w:t>World Health Organization. Global strategy on human resources for health: Workforce 2030. Geneva: World Health Organization; 2016.</w:t>
       </w:r>
     </w:p>
     <w:p>
@@ -2985,7 +3537,7 @@
         <w:pStyle w:val="ListNumber"/>
       </w:pPr>
       <w:r>
-        <w:t>National Institute of Standards and Technology. Digital Identity Guidelines, SP 800-63 series.</w:t>
+        <w:t>World Health Organization. Increasing access to health workers in remote and rural areas through improved retention: global policy recommendations. Geneva: World Health Organization; 2010.</w:t>
       </w:r>
     </w:p>
     <w:p>
@@ -2993,7 +3545,7 @@
         <w:pStyle w:val="ListNumber"/>
       </w:pPr>
       <w:r>
-        <w:t>International Civil Aviation Organization. Doc 9303 Machine Readable Travel Documents.</w:t>
+        <w:t>Financial Action Task Force. Guidance on Digital Identity. Paris: FATF; 2020.</w:t>
       </w:r>
     </w:p>
     <w:p>
@@ -3001,7 +3553,7 @@
         <w:pStyle w:val="ListNumber"/>
       </w:pPr>
       <w:r>
-        <w:t>Arlazarov V, et al. MIDV-500: a dataset for identity document analysis and recognition on mobile devices in video stream.</w:t>
+        <w:t>National Institute of Standards and Technology. Digital Identity Guidelines: Identity Proofing and Enrollment. NIST Special Publication 800-63A. Gaithersburg: NIST; latest revision.</w:t>
       </w:r>
     </w:p>
     <w:p>
@@ -3009,7 +3561,7 @@
         <w:pStyle w:val="ListNumber"/>
       </w:pPr>
       <w:r>
-        <w:t>Bulatov K, et al. MIDV-2020: a comprehensive benchmark dataset for identity document analysis.</w:t>
+        <w:t>International Civil Aviation Organization. Doc 9303: Machine Readable Travel Documents. Montreal: ICAO.</w:t>
       </w:r>
     </w:p>
     <w:p>
@@ -3017,7 +3569,7 @@
         <w:pStyle w:val="ListNumber"/>
       </w:pPr>
       <w:r>
-        <w:t>Li M, et al. TrOCR: Transformer-based optical character recognition.</w:t>
+        <w:t>Smith R. An overview of the Tesseract OCR engine. Proceedings of the Ninth International Conference on Document Analysis and Recognition. 2007.</w:t>
       </w:r>
     </w:p>
     <w:p>
@@ -3025,7 +3577,7 @@
         <w:pStyle w:val="ListNumber"/>
       </w:pPr>
       <w:r>
-        <w:t>Huang Y, et al. LayoutLMv3: pre-training for document AI with unified text and image masking.</w:t>
+        <w:t>Du Y, Li C, Guo R, et al. PP-OCR: A practical ultra lightweight OCR system. arXiv:2009.09941. 2020.</w:t>
       </w:r>
     </w:p>
     <w:p>
@@ -3033,7 +3585,7 @@
         <w:pStyle w:val="ListNumber"/>
       </w:pPr>
       <w:r>
-        <w:t>Kim G, et al. Donut: document understanding transformer without OCR.</w:t>
+        <w:t>Li C, Liu W, Guo R, et al. PP-OCRv3: More attempts for the improvement of ultra lightweight OCR system. arXiv:2206.03001. 2022.</w:t>
       </w:r>
     </w:p>
     <w:p>
@@ -3041,7 +3593,7 @@
         <w:pStyle w:val="ListNumber"/>
       </w:pPr>
       <w:r>
-        <w:t>Luo C, et al. GeoLayoutLM: geometric pre-training for visual information extraction.</w:t>
+        <w:t>Li M, Lv T, Chen J, et al. TrOCR: Transformer-based optical character recognition with pre-trained models. arXiv:2109.10282. 2021.</w:t>
       </w:r>
     </w:p>
     <w:p>
@@ -3049,7 +3601,7 @@
         <w:pStyle w:val="ListNumber"/>
       </w:pPr>
       <w:r>
-        <w:t>Shi Y, et al. DocFace: matching ID document photos to selfies.</w:t>
+        <w:t>Huang Y, Lv T, Cui L, Lu Y, Wei F. LayoutLMv3: Pre-training for document AI with unified text and image masking. arXiv:2204.08387. 2022.</w:t>
       </w:r>
     </w:p>
     <w:p>
@@ -3057,7 +3609,135 @@
         <w:pStyle w:val="ListNumber"/>
       </w:pPr>
       <w:r>
-        <w:t>Document liveness and recapture evaluation resources, including DLC-2021 and related identity-document authenticity work.</w:t>
+        <w:t>Kim G, Hong T, Yim M, et al. OCR-free Document Understanding Transformer. European Conference on Computer Vision. 2022.</w:t>
+      </w:r>
+    </w:p>
+    <w:p>
+      <w:pPr>
+        <w:pStyle w:val="ListNumber"/>
+      </w:pPr>
+      <w:r>
+        <w:t>Luo C, Li Y, Qiao L, et al. GeoLayoutLM: Geometric pre-training for visual information extraction. CVPR. 2023.</w:t>
+      </w:r>
+    </w:p>
+    <w:p>
+      <w:pPr>
+        <w:pStyle w:val="ListNumber"/>
+      </w:pPr>
+      <w:r>
+        <w:t>Qwen Team. Qwen2.5-VL Technical Report. arXiv:2502.13923. 2025.</w:t>
+      </w:r>
+    </w:p>
+    <w:p>
+      <w:pPr>
+        <w:pStyle w:val="ListNumber"/>
+      </w:pPr>
+      <w:r>
+        <w:t>Ollama. Ollama API documentation. Available from: https://docs.ollama.com/</w:t>
+      </w:r>
+    </w:p>
+    <w:p>
+      <w:pPr>
+        <w:pStyle w:val="ListNumber"/>
+      </w:pPr>
+      <w:r>
+        <w:t>Langflow. Langflow documentation. Available from: https://docs.langflow.org/</w:t>
+      </w:r>
+    </w:p>
+    <w:p>
+      <w:pPr>
+        <w:pStyle w:val="ListNumber"/>
+      </w:pPr>
+      <w:r>
+        <w:t>Vasey B, Nagendran M, Campbell B, et al. Reporting guideline for the early-stage clinical evaluation of decision support systems driven by artificial intelligence: DECIDE-AI. Nature Medicine. 2022;28:924-933.</w:t>
+      </w:r>
+    </w:p>
+    <w:p>
+      <w:pPr>
+        <w:pStyle w:val="ListNumber"/>
+      </w:pPr>
+      <w:r>
+        <w:t>Liu X, Rivera SC, Moher D, et al. Reporting guidelines for clinical trial reports for interventions involving artificial intelligence: the CONSORT-AI extension. Nature Medicine. 2020;26:1364-1374.</w:t>
+      </w:r>
+    </w:p>
+    <w:p>
+      <w:pPr>
+        <w:pStyle w:val="ListNumber"/>
+      </w:pPr>
+      <w:r>
+        <w:t>Collins GS, Dhiman P, Andaur Navarro CL, et al. TRIPOD+AI statement: updated guidance for reporting clinical prediction models that use regression or machine learning methods. BMJ. 2024;385:e078378.</w:t>
+      </w:r>
+    </w:p>
+    <w:p>
+      <w:pPr>
+        <w:pStyle w:val="ListNumber"/>
+      </w:pPr>
+      <w:r>
+        <w:t>Bossuyt PM, Reitsma JB, Bruns DE, et al. STARD 2015: an updated list of essential items for reporting diagnostic accuracy studies. BMJ. 2015;351:h5527.</w:t>
+      </w:r>
+    </w:p>
+    <w:p>
+      <w:pPr>
+        <w:pStyle w:val="ListNumber"/>
+      </w:pPr>
+      <w:r>
+        <w:t>Hevner AR, March ST, Park J, Ram S. Design science in information systems research. MIS Quarterly. 2004;28(1):75-105.</w:t>
+      </w:r>
+    </w:p>
+    <w:p>
+      <w:pPr>
+        <w:pStyle w:val="ListNumber"/>
+      </w:pPr>
+      <w:r>
+        <w:t>Mitchell M, Wu S, Zaldivar A, et al. Model cards for model reporting. Proceedings of the Conference on Fairness, Accountability, and Transparency. 2019.</w:t>
+      </w:r>
+    </w:p>
+    <w:p>
+      <w:pPr>
+        <w:pStyle w:val="ListNumber"/>
+      </w:pPr>
+      <w:r>
+        <w:t>Gebru T, Morgenstern J, Vecchione B, et al. Datasheets for datasets. Communications of the ACM. 2021;64(12):86-92.</w:t>
+      </w:r>
+    </w:p>
+    <w:p>
+      <w:pPr>
+        <w:pStyle w:val="ListNumber"/>
+      </w:pPr>
+      <w:r>
+        <w:t>Arlazarov VV, Bulatov K, Chernov TS, Arlazarov VL. MIDV-500: a dataset for identity document analysis and recognition on mobile devices in video stream. Computer Optics. 2019.</w:t>
+      </w:r>
+    </w:p>
+    <w:p>
+      <w:pPr>
+        <w:pStyle w:val="ListNumber"/>
+      </w:pPr>
+      <w:r>
+        <w:t>Bulatov K, Arlazarov VV, Chernov TS, Slavin O, Nikolaev D. MIDV-2020: a comprehensive benchmark dataset for identity document analysis. Computer Optics. 2021.</w:t>
+      </w:r>
+    </w:p>
+    <w:p>
+      <w:pPr>
+        <w:pStyle w:val="ListNumber"/>
+      </w:pPr>
+      <w:r>
+        <w:t>Shi Y, Jain AK. DocFace: matching ID document photos to selfies. IEEE International Joint Conference on Biometrics. 2018.</w:t>
+      </w:r>
+    </w:p>
+    <w:p>
+      <w:pPr>
+        <w:pStyle w:val="ListNumber"/>
+      </w:pPr>
+      <w:r>
+        <w:t>Yu Z, Qin Y, Zhao X, Li C, Zhao G. Searching central difference convolutional networks for face anti-spoofing. CVPR. 2020.</w:t>
+      </w:r>
+    </w:p>
+    <w:p>
+      <w:pPr>
+        <w:pStyle w:val="ListNumber"/>
+      </w:pPr>
+      <w:r>
+        <w:t>Dickerson JP, Procaccia AD, Sandholm T. Failure-aware kidney exchange. Management Science. 2019;65(4):1768-1791.</w:t>
       </w:r>
     </w:p>
     <w:sectPr>

</xml_diff>

<commit_message>
Tighten manuscript format and add editable figures
</commit_message>
<xml_diff>
--- a/manuscripts/eplacement_kyc_v4_1_validation/eplacement_kyc_verifier_v4_1_validation_manuscript.docx
+++ b/manuscripts/eplacement_kyc_v4_1_validation/eplacement_kyc_verifier_v4_1_validation_manuscript.docx
@@ -21,16 +21,6 @@
       </w:r>
     </w:p>
     <w:p>
-      <w:r>
-        <w:t>Repository branch: feature/manuscript-v4-1-validation</w:t>
-      </w:r>
-    </w:p>
-    <w:p>
-      <w:r>
-        <w:t>Manuscript status: revised development-and-evaluation draft</w:t>
-      </w:r>
-    </w:p>
-    <w:p>
       <w:pPr>
         <w:pStyle w:val="Heading1"/>
       </w:pPr>
@@ -39,68 +29,8 @@
       </w:r>
     </w:p>
     <w:p>
-      <w:pPr>
-        <w:pStyle w:val="Heading2"/>
-      </w:pPr>
       <w:r>
-        <w:t>Background</w:t>
-      </w:r>
-    </w:p>
-    <w:p>
-      <w:r>
-        <w:t>Public-sector human-resource application systems often require applicants to support personal, family, health, spouse-location, disability and examination-related claims with documentary proof. This creates a recurring administrative bottleneck: reviewers must reconcile structured form declarations with heterogeneous uploaded PDFs, many of which are scanned, multilingual, multi-page and only partially relevant. Existing electronic know-your-customer and digital identity systems address adjacent problems, but usually emphasise identity proofing, biometrics, liveness detection and document authenticity rather than claim-specific administrative evidence verification. A transparent, locally deployable method for first-pass proof checking could reduce avoidable manual review while preserving auditability and human oversight.</w:t>
-      </w:r>
-    </w:p>
-    <w:p>
-      <w:pPr>
-        <w:pStyle w:val="Heading2"/>
-      </w:pPr>
-      <w:r>
-        <w:t>Objective</w:t>
-      </w:r>
-    </w:p>
-    <w:p>
-      <w:r>
-        <w:t>We aimed to develop and evaluate a local-first, claim-guided document evidence verifier for public-sector human-resource applications. The primary contribution is the method: a workflow that reads applicant-declared claims, verifies only the evidence categories that were claimed, uses optical character recognition and local vision-language model inference to inspect uploaded PDFs, and produces auditable outputs for human review.</w:t>
-      </w:r>
-    </w:p>
-    <w:p>
-      <w:pPr>
-        <w:pStyle w:val="Heading2"/>
-      </w:pPr>
-      <w:r>
-        <w:t>Methods</w:t>
-      </w:r>
-    </w:p>
-    <w:p>
-      <w:r>
-        <w:t>We designed the verifier as a modular, human-in-the-loop document AI workflow. The system ingests structured applicant data, converts relevant fields into six claim booleans, retrieves uploaded PDF evidence, extracts direct PDF text where possible, renders scanned pages, routes low-text pages through OCR, and uses a locally hosted multimodal model through an orchestration harness to verify whether claimed categories are supported by visible document evidence. The six proof categories were marriage, self illness, family illness, spouse location, OKU self or family, and MedEX or other examination evidence. Unclaimed categories were deliberately skipped to reduce false-positive labelling. The system exported final tick sheets, scoring sheets, decision queues, proof-strength fields, page references, original PDF links and evidence summaries. We evaluated the method retrospectively against a manually adjudicated reference set of 238 applicants, corresponding to 1,428 applicant-evidence decisions.</w:t>
-      </w:r>
-    </w:p>
-    <w:p>
-      <w:pPr>
-        <w:pStyle w:val="Heading2"/>
-      </w:pPr>
-      <w:r>
-        <w:t>Results</w:t>
-      </w:r>
-    </w:p>
-    <w:p>
-      <w:r>
-        <w:t>The developed verifier completed the full evidence workflow and produced auditable applicant-level outputs. In the final validation set, it produced 415 true-positive, 103 false-positive, 856 true-negative and 54 false-negative evidence-level decisions. Overall accuracy was 89.0%, sensitivity 88.5%, specificity 89.3%, positive predictive value 80.1%, negative predictive value 94.1% and F1 score 84.1%. Exact applicant-level agreement across all six categories was 118/238 (49.6%). The system routed 64/238 applicants (26.9%) for manual review, implying that 174/238 (73.1%) could be handled through a first-pass no-check stream subject to governance controls. Performance was strongest for marriage and MedEX or other examination evidence, while family illness and spouse-location proof remained the main residual error sources.</w:t>
-      </w:r>
-    </w:p>
-    <w:p>
-      <w:pPr>
-        <w:pStyle w:val="Heading2"/>
-      </w:pPr>
-      <w:r>
-        <w:t>Conclusions</w:t>
-      </w:r>
-    </w:p>
-    <w:p>
-      <w:r>
-        <w:t>This work describes the development of a claim-guided, local-first AI-assisted method for administrative document evidence verification. The key advance is not a single model, but a constrained verification harness that combines structured claims, OCR routing, local multimodal inference, deterministic proof rules and auditable review outputs. The method appears useful as first-pass triage, but not as autonomous adjudication. Deployment should therefore be framed as decision support: reducing routine review burden, improving traceability and focusing human attention on missing, ambiguous or low-confidence proof.</w:t>
+        <w:t>Public-sector human-resource application systems often require people to support personal, family, health, disability, spouse-location and professional-training claims with documentary proof. This creates a recurrent administrative bottleneck: reviewers must reconcile structured form declarations with heterogeneous uploaded PDFs, many of which are scanned, multilingual, multi-page and only partly relevant. We developed a local-first, claim-guided document evidence verifier for this setting. The method first reads the applicant's declared claims, then verifies only those claimed evidence categories against the uploaded document bundle. The workflow combines deterministic claim extraction, direct PDF text extraction, optical character recognition (OCR), rendered page images, local vision-language model inference and structured proof-strength outputs within a human-in-the-loop review harness. Six proof categories were implemented: marriage, self illness, family illness, spouse location, OKU self or family, and MedEX or other examination evidence. In a retrospective validation set of 238 applicants and 1,428 applicant-evidence decisions, the verifier produced 415 true-positive, 103 false-positive, 856 true-negative and 54 false-negative decisions. Overall accuracy was 89.0%, sensitivity 88.5%, specificity 89.3%, positive predictive value 80.1%, negative predictive value 94.1% and F1 score 84.1%. The verifier routed 64 of 238 applicants (26.9%) for manual review, creating a first-pass no-check stream for 174 applicants (73.1%). The key contribution is not a single model, but an auditable AI-assisted workflow that constrains model interpretation using applicant claims, OCR-derived evidence, local multimodal inference and explicit human-review rules. The system should be understood as administrative decision support, not autonomous adjudication.</w:t>
       </w:r>
     </w:p>
     <w:p>
@@ -169,107 +99,32 @@
     </w:p>
     <w:p>
       <w:r>
-        <w:t>Human-resource application systems in large public services often depend on documentary proof. Applicants may declare that they are married, that a spouse is posted in a particular location, that they or a family member have health needs, that a disability-related consideration applies, or that a postgraduate or professional examination obligation should be considered. These claims are not merely clerical details. They can shape placement, transfer, prioritisation and review decisions. In health systems, where workforce distribution affects service access and continuity, administrative proof checking sits inside a wider policy problem: ensuring the right people are available in the right places while maintaining fair, transparent and defensible application processes [1,2].</w:t>
+        <w:t>Large public-sector human-resource systems routinely ask applicants to provide documentary evidence for claims that affect placement, transfer, prioritisation or review. An applicant may declare that they are married, that a spouse is posted in a particular location, that they or a family member have health needs, that disability-related consideration applies, or that a postgraduate or professional examination obligation should be recognised. These claims are administratively consequential because they influence how a workforce system balances individual circumstances against service need. In health services, this sits within a wider policy challenge: sustaining fair and transparent workforce processes while distributing personnel across facilities and geographies in ways that protect service access [1,2].</w:t>
       </w:r>
     </w:p>
     <w:p>
       <w:r>
-        <w:t>The proof-checking task is deceptively difficult. The structured form may be clean, but the supporting evidence is rarely clean. Applicants upload scanned marriage certificates, spouse posting letters, medical appointment notes, hospital reports, OKU cards, examination slips, screenshots, multi-document bundles and sometimes irrelevant or incomplete files. A single PDF can contain several unrelated pages. Some documents have extractable text; others are image-only. Some are in English, Bahasa Malaysia or Arabic-script/Jawi-like formats; others contain names, identity numbers, handwritten annotations, stamps and seals that are visually meaningful but poorly represented by optical character recognition (OCR). In these circumstances, manual review is slow but robust. Naive automation is fast but brittle.</w:t>
+        <w:t>The evidence-checking layer is often where the system slows down. The structured form may be legible, but the evidence bundle is rarely standardised. Applicants upload scanned marriage certificates, spouse posting letters, medical notes, hospital summaries, OKU cards, examination slips, screenshots and multi-document PDFs. Some pages have extractable text; others are image-only. Some documents are in English or Bahasa Malaysia; others contain Arabic-script or Jawi-like text, stamps, seals, tables, handwritten annotations and visual layouts that are meaningful to a human reviewer but poorly represented by OCR. Manual review is therefore still necessary, but it is repetitive, variable, difficult to scale and hard to audit consistently.</w:t>
       </w:r>
     </w:p>
     <w:p>
       <w:r>
-        <w:t>The central methodological problem is therefore not simply "classify a PDF". In an administrative application workflow, the task is claim-guided proof verification. The system should first ask what the applicant claimed, then inspect whether the uploaded document supports those claims. A broad classifier that labels every plausible category in a PDF can create false positives, because it may infer evidence that the applicant never declared. Conversely, a conservative text-only system can create false negatives when proof is visually obvious but OCR is poor. The verifier developed here was designed around this tension.</w:t>
+        <w:t>The methodological problem is not simply PDF classification. In this setting, the real question is whether the applicant uploaded sufficient proof for what they declared. A broad classifier that scans a PDF for all possible evidence categories can create false positives because it may identify plausible evidence that the applicant did not claim. Conversely, a conservative text-only pipeline can create false negatives when a visually obvious document is scanned poorly or has weak OCR. The method developed here addresses this by making the applicant claim the organising unit of verification. The verifier first determines what needs to be checked, and only then examines the document bundle for supporting evidence.</w:t>
       </w:r>
     </w:p>
     <w:p>
       <w:r>
-        <w:t>This paper reports the development and evaluation of a local-first AI-assisted evidence verification workflow for public-sector human-resource applications. We use "local-first" deliberately. The system was designed to run with local storage, local OCR and local language or vision-language model inference, rather than sending sensitive applicant documents to external document-processing APIs. This matters because uploaded evidence may contain family relationships, health information, disability documentation, identity numbers, workplace locations and examination records. A local-first approach does not remove governance obligations, but it reduces avoidable external data flows and supports clearer audit.</w:t>
+        <w:t>This work is adjacent to, but narrower than, full electronic know-your-customer or digital identity proofing. High-assurance e-KYC systems may include identity document authenticity checks, face matching, liveness detection, NFC or eMRTD chip validation, sanctions screening, device-risk signals and financial-crime risk scoring [3-5]. The present method does not attempt to perform that entire identity assurance stack. Its contribution is more specific: a local-first, auditable workflow for checking whether declared administrative claims are supported by uploaded documentary proof.</w:t>
       </w:r>
     </w:p>
     <w:p>
       <w:r>
-        <w:t>The work also sits within a broader document AI and e-KYC landscape. Commercial electronic know-your-customer systems are increasingly sophisticated, combining identity document capture, authenticity checks, face matching, liveness detection, sanctions screening and risk scoring [3-5]. However, the present use case is narrower and different. The aim is not to prove a person's identity from first principles. It is to assist human operators in verifying whether applicant-declared administrative claims are supported by uploaded evidence. This distinction is important: overclaiming full e-KYC capability would be inaccurate, while underdescribing the AI harness would miss the main methodological contribution.</w:t>
+        <w:t>The document AI literature provides several relevant building blocks. Open-source OCR engines such as Tesseract remain widely used for text extraction [6], while PaddleOCR and the PP-OCR family provide lightweight multilingual OCR approaches [7,8]. Transformer-based document models, including TrOCR, LayoutLMv3, Donut and GeoLayoutLM, show how document understanding can combine text, layout and image information [9-12]. Vision-language models such as Qwen2.5-VL extend this further by enabling local or server-side interpretation of document images and page layouts [13]. However, administrative evidence verification requires more than a capable model. It requires a harness that tells the model what to verify, limits the opportunity for over-labelling, preserves source evidence, and returns structured outputs that a human reviewer can inspect.</w:t>
       </w:r>
     </w:p>
     <w:p>
       <w:r>
-        <w:t>We therefore frame this as a methods-development study with retrospective validation. The objective was to build an auditable, claim-guided verifier and quantify its performance as a first-pass triage system. Accuracy is reported because the method must be evaluated, but accuracy is not the sole point of the paper. The main contribution is the architecture: structured claim extraction, evidence-category skipping, OCR-aware page processing, local multimodal verification, proof-strength scoring, and operator-facing outputs that preserve human review.</w:t>
-      </w:r>
-    </w:p>
-    <w:p>
-      <w:pPr>
-        <w:pStyle w:val="Heading1"/>
-      </w:pPr>
-      <w:r>
-        <w:t>Related Work</w:t>
-      </w:r>
-    </w:p>
-    <w:p>
-      <w:pPr>
-        <w:pStyle w:val="Heading2"/>
-      </w:pPr>
-      <w:r>
-        <w:t>Administrative Evidence Verification and Workforce Applications</w:t>
-      </w:r>
-    </w:p>
-    <w:p>
-      <w:r>
-        <w:t>Public-sector workforce systems frequently balance individual circumstances against service needs. In health workforce policy, international guidance emphasises the importance of staffing distribution, rural and remote access, retention, and transparent planning mechanisms [1,2]. Much of this literature concerns allocation, retention and workforce modelling rather than document verification itself. Yet in practice, many allocation or placement systems depend on administrative evidence: a claimed family, health, disability or training circumstance must be converted into a reviewable signal before it can inform a decision.</w:t>
-      </w:r>
-    </w:p>
-    <w:p>
-      <w:r>
-        <w:t>This creates a data-quality layer that is easy to understate. If evidence review is inconsistent, slow or opaque, downstream workforce decisions may become delayed, inequitable or difficult to audit. Conversely, if automation is too aggressive, applicants may be wrongly cleared or incorrectly flagged. The relevant policy problem is therefore not only efficiency; it is accountable administrative decision support.</w:t>
-      </w:r>
-    </w:p>
-    <w:p>
-      <w:pPr>
-        <w:pStyle w:val="Heading2"/>
-      </w:pPr>
-      <w:r>
-        <w:t>Document AI, OCR and Multimodal Understanding</w:t>
-      </w:r>
-    </w:p>
-    <w:p>
-      <w:r>
-        <w:t>Traditional OCR remains a core technology for digitising scanned documents. Tesseract is one of the most widely used open-source OCR engines and has long been applied to document analysis tasks [6]. PaddleOCR and the PP-OCR family extended practical OCR toward lightweight, multilingual and production-oriented pipelines [7,8]. More recent document AI approaches use Transformer architectures to model text, layout and images jointly. TrOCR recasts OCR as an end-to-end Transformer task [9]. LayoutLMv3 uses unified text and image masking for document AI pre-training [10]. Donut removes the external OCR dependency by treating document understanding as OCR-free image-to-sequence generation [11]. GeoLayoutLM emphasises geometric pre-training for visual information extraction [12].</w:t>
-      </w:r>
-    </w:p>
-    <w:p>
-      <w:r>
-        <w:t>These methods are relevant because administrative evidence is not only text. Layout, stamps, tables, official seals, document titles, signatures and page structure can all be meaningful. The verifier described here did not train a new document foundation model. Instead, it used a pragmatic harness: OCR and deterministic signals where they were reliable, page images where OCR was weak, and a local vision-language model where visual context mattered.</w:t>
-      </w:r>
-    </w:p>
-    <w:p>
-      <w:pPr>
-        <w:pStyle w:val="Heading2"/>
-      </w:pPr>
-      <w:r>
-        <w:t>Vision-Language Models and Local Inference</w:t>
-      </w:r>
-    </w:p>
-    <w:p>
-      <w:r>
-        <w:t>Vision-language models (VLMs) are increasingly capable of interpreting documents, charts, diagrams and screenshots. Qwen2.5-VL, for example, reports strong performance on document and diagram understanding tasks and is available in model sizes compatible with local deployment on suitable hardware [13]. The local inference layer in this work was served through Ollama, which exposes a local API for running language models, including vision-capable models, on local machines [14]. Langflow was used as the visual and Python-based orchestration layer, allowing the workflow to be represented as components rather than a monolithic script [15].</w:t>
-      </w:r>
-    </w:p>
-    <w:p>
-      <w:r>
-        <w:t>The important design choice was not merely "use a VLM". Unconstrained VLM calls can hallucinate, over-label ambiguous pages, or produce unstructured text that is difficult to audit. The harness therefore constrained model use in four ways. First, the prompt supplied applicant claims and told the model to verify only claimed categories. Second, deterministic rules and OCR-derived signals shortlisted likely evidence pages. Third, model output was parsed into a fixed schema with proof status, proof strength, supporting page and evidence summary. Fourth, the system defaulted to manual review when proof was missing, ambiguous or low confidence.</w:t>
-      </w:r>
-    </w:p>
-    <w:p>
-      <w:pPr>
-        <w:pStyle w:val="Heading2"/>
-      </w:pPr>
-      <w:r>
-        <w:t>Reporting and Governance of AI Decision Support</w:t>
-      </w:r>
-    </w:p>
-    <w:p>
-      <w:r>
-        <w:t>The reporting of AI-assisted decision support should separate development, validation and deployment. DECIDE-AI emphasises early-stage evaluation of AI decision-support systems and the importance of human-in-the-loop workflows [16]. CONSORT-AI and TRIPOD+AI similarly reflect the broader movement toward transparent reporting of AI methods, settings, failure modes and human interaction [17,18]. Diagnostic accuracy reporting guidance such as STARD remains useful when an algorithmic output is compared with a reference standard [19], but it does not by itself capture workflow design, auditability or operator burden. This manuscript therefore combines a development narrative with a validation analysis.</w:t>
+        <w:t>We therefore report the development and retrospective evaluation of a claim-guided document evidence verifier. The objective was to build a method that could: (i) read applicant claims from structured data; (ii) inspect heterogeneous uploaded evidence; (iii) use OCR and local multimodal inference where useful; (iv) avoid labelling unclaimed categories as positive; and (v) produce auditable outputs for human review. Accuracy was measured as part of the method evaluation, but the primary contribution is the workflow design.</w:t>
       </w:r>
     </w:p>
     <w:p>
@@ -336,12 +191,17 @@
         <w:pStyle w:val="Heading2"/>
       </w:pPr>
       <w:r>
-        <w:t>Study Design</w:t>
+        <w:t>Study Setting and Design</w:t>
       </w:r>
     </w:p>
     <w:p>
       <w:r>
-        <w:t>We conducted a methods-development and retrospective evaluation study. The study object was a working software method for administrative evidence verification, not a standalone predictive model. Development was iterative and operationally driven: early broad-classification prototypes were replaced by a claim-guided verifier after error review showed that broad classification created false positives and missed visually obvious evidence. The final method was then evaluated against a manually adjudicated validation set.</w:t>
+        <w:t>We conducted a methods-development and retrospective evaluation study in a public-sector human-resource application context. The target users were operators reviewing applications from people who had entered structured form data and uploaded supporting PDFs. The method was developed for administrative proof checking rather than full identity proofing. The six target proof categories were marriage, self illness, family illness, spouse location, OKU self or family, and MedEX or other examination evidence. These categories were selected because they represent common forms of applicant-declared circumstances that require documentary substantiation.</w:t>
+      </w:r>
+    </w:p>
+    <w:p>
+      <w:r>
+        <w:t>Development was iterative and error-led. Early broad-classification prototypes treated the uploaded PDF as the primary object and attempted to infer all possible evidence categories from the document bundle. Error review showed that this approach was misaligned with the operational question because it could label plausible but unclaimed evidence. The final method therefore used claim-guided verification: the applicant row defined the claims to be checked, and unclaimed categories were skipped rather than classified.</w:t>
       </w:r>
     </w:p>
     <w:p>
@@ -349,170 +209,22 @@
         <w:pStyle w:val="Heading2"/>
       </w:pPr>
       <w:r>
-        <w:t>Setting and Target Use Case</w:t>
+        <w:t>Claim-Guided Verifier</w:t>
       </w:r>
     </w:p>
     <w:p>
       <w:r>
-        <w:t>The target use case was a public-sector human-resource application workflow in which applicants submit structured form data and upload supporting PDFs. The setting involved people applying for placement-related consideration and submitting documentary evidence for personal, family, spouse-location, health, disability or examination-related claims. The manuscript intentionally uses generic terminology because the method is not specific to one professional discipline. The same proof-checking problem can arise in any large administrative workforce process where declared circumstances must be supported by uploaded evidence.</w:t>
-      </w:r>
-    </w:p>
-    <w:p>
-      <w:pPr>
-        <w:pStyle w:val="Heading2"/>
-      </w:pPr>
-      <w:r>
-        <w:t>Design Requirements</w:t>
+        <w:t>Each applicant row was normalised into six boolean claim fields. Marriage claims were derived from marital and spouse-related fields. Self-illness claims were derived from applicant health fields. Family-illness claims used spouse, child, parent or dependent health information. Spouse-location claims used spouse work, posting, residence or location fields. OKU claims used applicant or family disability indicators. MedEX or other examination claims used postgraduate, specialist-training or examination fields. When a row contained contradictory or unclear structured data, the verifier routed the applicant to manual review rather than silently forcing an interpretation.</w:t>
       </w:r>
     </w:p>
     <w:p>
       <w:r>
-        <w:t>We defined seven implementation requirements before the final evaluation:</w:t>
-      </w:r>
-    </w:p>
-    <w:p>
-      <w:pPr>
-        <w:pStyle w:val="ListBullet"/>
-      </w:pPr>
-      <w:r>
-        <w:t>The system must read applicant claims before reading the document evidence.</w:t>
-      </w:r>
-    </w:p>
-    <w:p>
-      <w:pPr>
-        <w:pStyle w:val="ListBullet"/>
-      </w:pPr>
-      <w:r>
-        <w:t>The system must verify only claimed evidence categories and avoid labelling unclaimed categories as positive.</w:t>
-      </w:r>
-    </w:p>
-    <w:p>
-      <w:pPr>
-        <w:pStyle w:val="ListBullet"/>
-      </w:pPr>
-      <w:r>
-        <w:t>The system must handle text PDFs and scanned image PDFs.</w:t>
-      </w:r>
-    </w:p>
-    <w:p>
-      <w:pPr>
-        <w:pStyle w:val="ListBullet"/>
-      </w:pPr>
-      <w:r>
-        <w:t>The system must use page images and visual cues when OCR is weak.</w:t>
-      </w:r>
-    </w:p>
-    <w:p>
-      <w:pPr>
-        <w:pStyle w:val="ListBullet"/>
-      </w:pPr>
-      <w:r>
-        <w:t>The system must run locally where feasible, including local model inference.</w:t>
-      </w:r>
-    </w:p>
-    <w:p>
-      <w:pPr>
-        <w:pStyle w:val="ListBullet"/>
-      </w:pPr>
-      <w:r>
-        <w:t>The system must produce operator-facing outputs, not only machine labels.</w:t>
-      </w:r>
-    </w:p>
-    <w:p>
-      <w:pPr>
-        <w:pStyle w:val="ListBullet"/>
-      </w:pPr>
-      <w:r>
-        <w:t>The system must preserve original PDF links, page references, evidence summaries and proof-strength fields for audit.</w:t>
+        <w:t>The evidence definitions were deliberately operational. Marriage proof required a marriage or nikah certificate or similarly clear spouse-relationship evidence. Self-illness proof required medical evidence about the applicant. Family-illness proof required medical evidence about a spouse, child, parent, dependent or other relevant family member. Spouse-location proof required evidence of spouse workplace, posting, residence or location. OKU proof required explicit disability or OKU documentation. MedEX or other examination proof required official examination registration, attendance, result, certificate or postgraduate/specialist examination documentation; routine physical examination forms, ordinary medical check-ups and generic medical reports were not treated as examination evidence.</w:t>
       </w:r>
     </w:p>
     <w:p>
       <w:r>
-        <w:t>These requirements shaped the architecture more than any single model choice.</w:t>
-      </w:r>
-    </w:p>
-    <w:p>
-      <w:pPr>
-        <w:pStyle w:val="Heading2"/>
-      </w:pPr>
-      <w:r>
-        <w:t>Evidence Categories and Claim Extraction</w:t>
-      </w:r>
-    </w:p>
-    <w:p>
-      <w:r>
-        <w:t>The verifier mapped each applicant row into six boolean claims:</w:t>
-      </w:r>
-    </w:p>
-    <w:p>
-      <w:pPr>
-        <w:pStyle w:val="ListBullet"/>
-      </w:pPr>
-      <w:r>
-        <w:t>claimed_marriage</w:t>
-      </w:r>
-    </w:p>
-    <w:p>
-      <w:pPr>
-        <w:pStyle w:val="ListBullet"/>
-      </w:pPr>
-      <w:r>
-        <w:t>claimed_self_illness</w:t>
-      </w:r>
-    </w:p>
-    <w:p>
-      <w:pPr>
-        <w:pStyle w:val="ListBullet"/>
-      </w:pPr>
-      <w:r>
-        <w:t>claimed_family_illness</w:t>
-      </w:r>
-    </w:p>
-    <w:p>
-      <w:pPr>
-        <w:pStyle w:val="ListBullet"/>
-      </w:pPr>
-      <w:r>
-        <w:t>claimed_spouse_location</w:t>
-      </w:r>
-    </w:p>
-    <w:p>
-      <w:pPr>
-        <w:pStyle w:val="ListBullet"/>
-      </w:pPr>
-      <w:r>
-        <w:t>claimed_oku_self_or_family</w:t>
-      </w:r>
-    </w:p>
-    <w:p>
-      <w:pPr>
-        <w:pStyle w:val="ListBullet"/>
-      </w:pPr>
-      <w:r>
-        <w:t>claimed_medex_other_exam</w:t>
-      </w:r>
-    </w:p>
-    <w:p>
-      <w:r>
-        <w:t>Claim extraction used deterministic rules over normalised spreadsheet fields. For example, marital-status and spouse-related fields informed marriage and spouse-location claims; applicant health fields informed self-illness claims; spouse, child or parent health indicators informed family-illness claims; OKU-related fields informed disability claims; and postgraduate or examination fields informed MedEX or other examination claims. If a row contained contradictory or unclear structured evidence, the applicant was routed to manual review rather than silently interpreted.</w:t>
-      </w:r>
-    </w:p>
-    <w:p>
-      <w:r>
-        <w:t>The six proof categories were intentionally practical rather than ontological. They reflect administrative review needs. Marriage proof could include marriage or nikah certificates and clear spouse relationship evidence. Self-illness proof required medical evidence about the applicant. Family-illness proof required medical evidence about a spouse, child, parent or relevant family member. Spouse-location proof required evidence of spouse workplace, posting, residence or location. OKU proof required explicit OKU or disability evidence. MedEX or other examination proof required examination registration, attendance, result, certificate or official postgraduate/specialist examination documentation; generic physical examination or routine medical notes were not sufficient.</w:t>
-      </w:r>
-    </w:p>
-    <w:p>
-      <w:pPr>
-        <w:pStyle w:val="Heading2"/>
-      </w:pPr>
-      <w:r>
-        <w:t>Workflow Architecture</w:t>
-      </w:r>
-    </w:p>
-    <w:p>
-      <w:r>
-        <w:t>The implemented workflow had seven stages. First, applicant spreadsheets were ingested and mapped to canonical columns. Second, claim extraction converted structured fields into the six claim booleans. Third, supporting PDFs were acquired from original uploaded links or local cached paths. Fourth, PDFs were processed through direct text extraction and page rendering. Fifth, OCR routing selected direct PDF text where available and OCR fallback for scanned or low-text pages. Sixth, the AI harness generated claim-specific evidence signals. Finally, export writers produced decision queues, scoring sheets, final tick sheets, merged outputs and audit payloads.</w:t>
+        <w:t>The verifier was implemented as a local-first pipeline. Applicant spreadsheets were ingested and mapped to canonical fields. The claim extractor converted each row into the six claim booleans. The document fetcher retrieved the uploaded PDF from the original link or from a local cache. The document processor extracted direct PDF text where available and rendered page images for scanned or visually important pages. OCR was used when direct text was absent, sparse or low quality. The evidence verifier then combined deterministic rules, page-level signals, OCR-derived text and local model inference to decide whether each claimed category was supported. The final output was a reviewer-facing decision table with proof status, proof strength, supporting page, evidence summary, confidence and manual-review status.</w:t>
       </w:r>
     </w:p>
     <w:p>
@@ -567,95 +279,18 @@
       </w:r>
     </w:p>
     <w:p>
-      <w:pPr>
-        <w:pStyle w:val="Heading2"/>
-      </w:pPr>
       <w:r>
-        <w:t>OCR and Page Processing</w:t>
+        <w:t>The OCR layer followed a direct-text-first principle to avoid unnecessary processing. If the PDF contained sufficient embedded text, that text was used directly. If not, pages were rendered as images and processed through OCR. Page-level metadata included page number, extracted text, OCR confidence where available, image path, keyword signals and candidate evidence matches. This metadata supported page shortlisting so that model calls focused on likely pages rather than scanning every page equally.</w:t>
       </w:r>
     </w:p>
     <w:p>
       <w:r>
-        <w:t>The OCR design followed a direct-text-first principle. If a PDF contained sufficient extractable text, the system avoided unnecessary OCR. If direct text was absent, sparse or low quality, pages were rendered as images and routed through OCR. The OCR route could use Tesseract-style extraction for standard printed text and a PaddleOCR fallback for difficult pages. Page images were retained for downstream visual inspection by the model and the human reviewer.</w:t>
+        <w:t>The AI harness was designed as a constrained verification layer rather than a free-form chatbot. Langflow-shaped orchestration made the processing path inspectable as modular components. Ollama served the local language and vision-language model endpoint, with Qwen2.5-VL used for page-level visual verification when image evidence was required [13-15]. The prompt supplied applicant context and explicitly instructed the model to verify only categories that the applicant had claimed. Model output was parsed into a fixed schema containing proof_found, proof_strength, supporting_page, evidence_summary and confidence. The decision policy marked applicants for manual review when proof was missing, ambiguous, low confidence or affected by download, rendering or OCR failure.</w:t>
       </w:r>
     </w:p>
     <w:p>
       <w:r>
-        <w:t>The system also generated page-level metadata: page number, extracted text, OCR confidence where available, image path, candidate signals and matching keywords. This metadata served two purposes. First, it reduced unnecessary model calls by shortlisting likely pages. Second, it made the final output auditable because reviewers could see why a page was considered relevant.</w:t>
-      </w:r>
-    </w:p>
-    <w:p>
-      <w:pPr>
-        <w:pStyle w:val="Heading2"/>
-      </w:pPr>
-      <w:r>
-        <w:t>AI Harness</w:t>
-      </w:r>
-    </w:p>
-    <w:p>
-      <w:r>
-        <w:t>The AI harness was the central methodological component. It was designed as a constrained verification layer rather than an unconstrained chatbot or free-form classifier. The harness included:</w:t>
-      </w:r>
-    </w:p>
-    <w:p>
-      <w:pPr>
-        <w:pStyle w:val="ListBullet"/>
-      </w:pPr>
-      <w:r>
-        <w:t>Langflow-shaped orchestration to make the processing chain inspectable and modular.</w:t>
-      </w:r>
-    </w:p>
-    <w:p>
-      <w:pPr>
-        <w:pStyle w:val="ListBullet"/>
-      </w:pPr>
-      <w:r>
-        <w:t>Deterministic claim extraction and skip logic for unclaimed categories.</w:t>
-      </w:r>
-    </w:p>
-    <w:p>
-      <w:pPr>
-        <w:pStyle w:val="ListBullet"/>
-      </w:pPr>
-      <w:r>
-        <w:t>OCR-derived page signals including keywords, names, identity numbers and layout hints.</w:t>
-      </w:r>
-    </w:p>
-    <w:p>
-      <w:pPr>
-        <w:pStyle w:val="ListBullet"/>
-      </w:pPr>
-      <w:r>
-        <w:t>Local multimodal inference through Ollama and Qwen2.5-VL for visually complex or OCR-poor pages.</w:t>
-      </w:r>
-    </w:p>
-    <w:p>
-      <w:pPr>
-        <w:pStyle w:val="ListBullet"/>
-      </w:pPr>
-      <w:r>
-        <w:t>Structured prompts that explicitly instructed the model not to classify the whole PDF and not to infer unclaimed categories.</w:t>
-      </w:r>
-    </w:p>
-    <w:p>
-      <w:pPr>
-        <w:pStyle w:val="ListBullet"/>
-      </w:pPr>
-      <w:r>
-        <w:t>JSON schema parsing to force outputs into proof_found, proof_strength, supporting_page, evidence_summary and confidence fields.</w:t>
-      </w:r>
-    </w:p>
-    <w:p>
-      <w:pPr>
-        <w:pStyle w:val="ListBullet"/>
-      </w:pPr>
-      <w:r>
-        <w:t>A decision policy that set check_required when proof was missing, ambiguous, low confidence or affected by process failure.</w:t>
-      </w:r>
-    </w:p>
-    <w:p>
-      <w:r>
-        <w:t>This design reflects a deliberate separation of responsibilities. The spreadsheet and rules layer defines what needs to be checked. OCR and rendering define what can be read or seen. The VLM adjudicates ambiguous visual evidence within a constrained prompt. The parser and decision policy translate model output into auditable structured fields. The operator interface then displays the result with a link to the original PDF.</w:t>
+        <w:t>This harness design was central to the method. The deterministic layer defined what needed to be checked; OCR and page rendering defined what could be read or seen; the vision-language model interpreted ambiguous or OCR-poor evidence within a bounded task; the parser converted output into structured fields; and the reviewer interface preserved human oversight. This separation of responsibilities was intended to reduce both model overreach and opaque automation.</w:t>
       </w:r>
     </w:p>
     <w:p>
@@ -714,173 +349,12 @@
         <w:pStyle w:val="Heading2"/>
       </w:pPr>
       <w:r>
-        <w:t>Claim-Guided Verification Logic</w:t>
+        <w:t>Validation Analysis</w:t>
       </w:r>
     </w:p>
     <w:p>
       <w:r>
-        <w:t>The final method differed from earlier broad classification in one essential way. It did not ask, "What documents are in this PDF?" It asked, "For the claims this applicant declared, does the uploaded PDF contain sufficient proof?" This is a smaller and more operationally meaningful question.</w:t>
-      </w:r>
-    </w:p>
-    <w:p>
-      <w:r>
-        <w:t>If an applicant did not claim a category, the verifier did not mark that category as proof_found even if the document contained something suggestive. If an applicant did claim a category, the verifier searched for sufficient proof and produced one of three practical states: supported, missing or ambiguous. Ambiguous and low-confidence outputs were routed to manual review. This design was intended to reduce false positives from unclaimed evidence while preserving a pathway for human judgement.</w:t>
-      </w:r>
-    </w:p>
-    <w:p>
-      <w:pPr>
-        <w:jc w:val="center"/>
-      </w:pPr>
-      <w:r>
-        <w:drawing>
-          <wp:inline xmlns:a="http://schemas.openxmlformats.org/drawingml/2006/main" xmlns:pic="http://schemas.openxmlformats.org/drawingml/2006/picture">
-            <wp:extent cx="6217920" cy="3532909"/>
-            <wp:docPr id="5" name="Picture 5"/>
-            <wp:cNvGraphicFramePr>
-              <a:graphicFrameLocks noChangeAspect="1"/>
-            </wp:cNvGraphicFramePr>
-            <a:graphic>
-              <a:graphicData uri="http://schemas.openxmlformats.org/drawingml/2006/picture">
-                <pic:pic>
-                  <pic:nvPicPr>
-                    <pic:cNvPr id="0" name="figure_5_method_shift.png"/>
-                    <pic:cNvPicPr/>
-                  </pic:nvPicPr>
-                  <pic:blipFill>
-                    <a:blip r:embed="rId13"/>
-                    <a:stretch>
-                      <a:fillRect/>
-                    </a:stretch>
-                  </pic:blipFill>
-                  <pic:spPr>
-                    <a:xfrm>
-                      <a:off x="0" y="0"/>
-                      <a:ext cx="6217920" cy="3532909"/>
-                    </a:xfrm>
-                    <a:prstGeom prst="rect"/>
-                  </pic:spPr>
-                </pic:pic>
-              </a:graphicData>
-            </a:graphic>
-          </wp:inline>
-        </w:drawing>
-      </w:r>
-    </w:p>
-    <w:p>
-      <w:pPr>
-        <w:jc w:val="center"/>
-      </w:pPr>
-      <w:r>
-        <w:rPr>
-          <w:i/>
-          <w:sz w:val="18"/>
-        </w:rPr>
-        <w:t>Figure 5. From broad classification to claim-guided proof verification.</w:t>
-      </w:r>
-    </w:p>
-    <w:p>
-      <w:pPr>
-        <w:pStyle w:val="Heading2"/>
-      </w:pPr>
-      <w:r>
-        <w:t>Outputs</w:t>
-      </w:r>
-    </w:p>
-    <w:p>
-      <w:r>
-        <w:t>The system produced several operator-facing artifacts:</w:t>
-      </w:r>
-    </w:p>
-    <w:p>
-      <w:pPr>
-        <w:pStyle w:val="ListBullet"/>
-      </w:pPr>
-      <w:r>
-        <w:t>A final tick sheet with one row per applicant and one column per evidence class.</w:t>
-      </w:r>
-    </w:p>
-    <w:p>
-      <w:pPr>
-        <w:pStyle w:val="ListBullet"/>
-      </w:pPr>
-      <w:r>
-        <w:t>A scoring sheet for manual validation and subsequent model comparison.</w:t>
-      </w:r>
-    </w:p>
-    <w:p>
-      <w:pPr>
-        <w:pStyle w:val="ListBullet"/>
-      </w:pPr>
-      <w:r>
-        <w:t>A decision queue indicating check or no-check status.</w:t>
-      </w:r>
-    </w:p>
-    <w:p>
-      <w:pPr>
-        <w:pStyle w:val="ListBullet"/>
-      </w:pPr>
-      <w:r>
-        <w:t>A review queue for applicants requiring manual inspection.</w:t>
-      </w:r>
-    </w:p>
-    <w:p>
-      <w:pPr>
-        <w:pStyle w:val="ListBullet"/>
-      </w:pPr>
-      <w:r>
-        <w:t>Supporting-page and evidence-summary fields.</w:t>
-      </w:r>
-    </w:p>
-    <w:p>
-      <w:pPr>
-        <w:pStyle w:val="ListBullet"/>
-      </w:pPr>
-      <w:r>
-        <w:t>Original PDF links for immediate click-through review.</w:t>
-      </w:r>
-    </w:p>
-    <w:p>
-      <w:pPr>
-        <w:pStyle w:val="ListBullet"/>
-      </w:pPr>
-      <w:r>
-        <w:t>Proof-strength and confidence fields for each claimed category.</w:t>
-      </w:r>
-    </w:p>
-    <w:p>
-      <w:r>
-        <w:t>These outputs were designed for workflow use. The system did not merely provide labels; it provided a structured review surface that could support manual checking, quality assurance and future recalibration.</w:t>
-      </w:r>
-    </w:p>
-    <w:p>
-      <w:pPr>
-        <w:pStyle w:val="Heading2"/>
-      </w:pPr>
-      <w:r>
-        <w:t>Validation Dataset</w:t>
-      </w:r>
-    </w:p>
-    <w:p>
-      <w:r>
-        <w:t>The final validation used a manually adjudicated reference workbook. The analytic set included 238 matched applicants. Each applicant contributed six applicant-evidence decisions, producing 1,428 binary decisions. Manual adjudication defined whether each evidence category was present or absent.</w:t>
-      </w:r>
-    </w:p>
-    <w:p>
-      <w:pPr>
-        <w:pStyle w:val="Heading2"/>
-      </w:pPr>
-      <w:r>
-        <w:t>Evaluation Metrics</w:t>
-      </w:r>
-    </w:p>
-    <w:p>
-      <w:r>
-        <w:t>We calculated true positives, false positives, true negatives and false negatives at the evidence-decision level. We then estimated accuracy, sensitivity, specificity, positive predictive value (PPV), negative predictive value (NPV) and F1 score. We also calculated exact applicant-level agreement, defined as all six evidence categories matching the manual reference standard for a given applicant. The manual review rate was calculated as the proportion of applicants routed to check.</w:t>
-      </w:r>
-    </w:p>
-    <w:p>
-      <w:r>
-        <w:t>Because each applicant contributed six correlated evidence decisions, the decision-level metrics should be interpreted as descriptive rather than fully independent observations. Approximate Wilson intervals were generated in the machine-readable validation summary, but the manuscript emphasises point estimates and operational interpretation. Future work should use applicant-clustered bootstrap intervals.</w:t>
+        <w:t>The method was evaluated against a manually adjudicated validation workbook. The analytic set contained 238 matched applicants. Each applicant contributed six applicant-evidence decisions, producing 1,428 binary decisions. Manual adjudication defined whether each evidence category was present or absent. We calculated true positives, false positives, true negatives and false negatives at the evidence-decision level, followed by accuracy, sensitivity, specificity, positive predictive value, negative predictive value and F1 score. We also calculated exact applicant-level agreement, defined as all six evidence categories matching the manual reference standard for a given applicant, and the manual review rate, defined as the proportion of applicants routed to check. Because six evidence decisions were clustered within each applicant, these metrics are interpreted as descriptive evaluation statistics rather than independent observations.</w:t>
       </w:r>
     </w:p>
     <w:p>
@@ -893,7 +367,7 @@
     </w:p>
     <w:p>
       <w:r>
-        <w:t>The development workflow intentionally avoided committing raw applicant PDFs, OCR caches, local databases or applicant-level error sheets to source control. The manuscript folder contains de-identified aggregate validation outputs only. Before operational deployment or external submission, the method should be accompanied by a data protection statement, access-control model, retention policy, model-governance note and reviewer accountability process.</w:t>
+        <w:t>The development workflow avoided committing raw applicant PDFs, OCR caches, local databases or applicant-level identifiable error sheets to source control. The manuscript artifacts contain aggregate validation tables only. The intended deployment posture is human-in-the-loop decision support. Before operational use, the method should be paired with access controls, retention rules, audit sampling, reviewer accountability and a clear policy that no adverse decision is made solely from the verifier output.</w:t>
       </w:r>
     </w:p>
     <w:p>
@@ -905,82 +379,13 @@
       </w:r>
     </w:p>
     <w:p>
-      <w:pPr>
-        <w:pStyle w:val="Heading2"/>
-      </w:pPr>
       <w:r>
-        <w:t>Developed System Artifact</w:t>
+        <w:t>The developed method produced an operational verifier that could ingest structured applicant data, retrieve uploaded PDFs, process text and image documents, invoke local model inference within a constrained harness, and export auditable applicant-level outputs. The main development result was the shift from broad document classification to claim-guided proof verification. In practical terms, the verifier no longer asked "what is in this PDF?" It asked "does the uploaded evidence support the claims this applicant declared?" This changed the behaviour of the system by reducing the incentive to reward unclaimed categories and by making the review output more aligned with the administrative task.</w:t>
       </w:r>
     </w:p>
     <w:p>
       <w:r>
-        <w:t>The final artifact was a local-first, claim-guided verifier that could ingest applicant data, retrieve uploaded PDFs, process text and image documents, invoke a constrained local VLM, and export audit-ready review outputs. The main development result was not a black-box model but a repeatable workflow that converted applicant-declared claims into proof-checking tasks.</w:t>
-      </w:r>
-    </w:p>
-    <w:p>
-      <w:r>
-        <w:t>The verifier operationalised six design levers:</w:t>
-      </w:r>
-    </w:p>
-    <w:p>
-      <w:pPr>
-        <w:pStyle w:val="ListBullet"/>
-      </w:pPr>
-      <w:r>
-        <w:t>Claim primacy: structured applicant claims define what the system checks.</w:t>
-      </w:r>
-    </w:p>
-    <w:p>
-      <w:pPr>
-        <w:pStyle w:val="ListBullet"/>
-      </w:pPr>
-      <w:r>
-        <w:t>Category skipping: unclaimed categories are not labelled as positive evidence.</w:t>
-      </w:r>
-    </w:p>
-    <w:p>
-      <w:pPr>
-        <w:pStyle w:val="ListBullet"/>
-      </w:pPr>
-      <w:r>
-        <w:t>OCR-aware perception: direct text, OCR and page images are combined rather than treated as interchangeable.</w:t>
-      </w:r>
-    </w:p>
-    <w:p>
-      <w:pPr>
-        <w:pStyle w:val="ListBullet"/>
-      </w:pPr>
-      <w:r>
-        <w:t>Constrained local VLM inference: the model is prompted with claim context and forced into structured outputs.</w:t>
-      </w:r>
-    </w:p>
-    <w:p>
-      <w:pPr>
-        <w:pStyle w:val="ListBullet"/>
-      </w:pPr>
-      <w:r>
-        <w:t>Proof-strength adjudication: evidence is represented as strength and support, not only present or absent.</w:t>
-      </w:r>
-    </w:p>
-    <w:p>
-      <w:pPr>
-        <w:pStyle w:val="ListBullet"/>
-      </w:pPr>
-      <w:r>
-        <w:t>Human-in-the-loop export: outputs are built for review, validation and recalibration.</w:t>
-      </w:r>
-    </w:p>
-    <w:p>
-      <w:pPr>
-        <w:pStyle w:val="Heading2"/>
-      </w:pPr>
-      <w:r>
-        <w:t>Validation Set and Overall Performance</w:t>
-      </w:r>
-    </w:p>
-    <w:p>
-      <w:r>
-        <w:t>The validation set included 238 applicants and 1,428 evidence-level decisions. The verifier produced 415 true positives, 103 false positives, 856 true negatives and 54 false negatives. Overall accuracy was 89.0%, sensitivity 88.5%, specificity 89.3%, PPV 80.1%, NPV 94.1% and F1 score 84.1%.</w:t>
+        <w:t>The final validation set contained 238 applicants and 1,428 evidence-level decisions. The verifier produced 415 true positives, 103 false positives, 856 true negatives and 54 false negatives. Overall accuracy was 89.0%, sensitivity 88.5%, specificity 89.3%, positive predictive value 80.1%, negative predictive value 94.1% and F1 score 84.1%. Exact applicant-level agreement was 118 of 238 applicants (49.6%). The system routed 64 applicants (26.9%) for manual review and left 174 applicants (73.1%) in the no-check stream.</w:t>
       </w:r>
     </w:p>
     <w:tbl>
@@ -1402,21 +807,8 @@
     </w:tbl>
     <w:p/>
     <w:p>
-      <w:pPr>
-        <w:pStyle w:val="Heading2"/>
-      </w:pPr>
       <w:r>
-        <w:t>Evidence-Type Performance</w:t>
-      </w:r>
-    </w:p>
-    <w:p>
-      <w:r>
-        <w:t>Performance varied by evidence category. Marriage evidence performed strongly, with sensitivity of 88.8%, specificity of 98.9%, PPV of 99.2% and F1 score of 93.7%. MedEX or other examination evidence also performed well, with sensitivity of 91.4%, specificity of 87.9% and F1 score of 85.1%. These categories have relatively distinctive document forms or vocabulary.</w:t>
-      </w:r>
-    </w:p>
-    <w:p>
-      <w:r>
-        <w:t>Family illness and spouse-location evidence were more difficult. Family illness had sensitivity of 83.9% but specificity of 69.5%, while spouse location had sensitivity of 98.1% and specificity of 75.4%. This pattern suggests that the verifier was effective at detecting possible relational evidence, but sometimes over-called documents where the relationship or purpose of the document was not sufficiently clear.</w:t>
+        <w:t>Performance varied by evidence category. Marriage evidence performed strongly, with sensitivity of 88.8%, specificity of 98.9%, positive predictive value of 99.2% and F1 score of 93.7%. MedEX or other examination evidence also performed well, with sensitivity of 91.4%, specificity of 87.9% and F1 score of 85.1%. These categories often have distinctive document structures, official titles or examination-specific vocabulary. Family illness and spouse-location evidence remained more difficult because they require relationship resolution, not merely document-type recognition. Family illness had sensitivity of 83.9% but specificity of 69.5%, while spouse location had sensitivity of 98.1% and specificity of 75.4%. This suggests that the verifier was effective at detecting possible relational evidence, but sometimes over-called documents where the relationship or purpose of the document was not sufficiently clear.</w:t>
       </w:r>
     </w:p>
     <w:tbl>
@@ -2763,7 +2155,7 @@
         <w:drawing>
           <wp:inline xmlns:a="http://schemas.openxmlformats.org/drawingml/2006/main" xmlns:pic="http://schemas.openxmlformats.org/drawingml/2006/picture">
             <wp:extent cx="6217920" cy="4055165"/>
-            <wp:docPr id="6" name="Picture 6"/>
+            <wp:docPr id="5" name="Picture 5"/>
             <wp:cNvGraphicFramePr>
               <a:graphicFrameLocks noChangeAspect="1"/>
             </wp:cNvGraphicFramePr>
@@ -2775,7 +2167,7 @@
                     <pic:cNvPicPr/>
                   </pic:nvPicPr>
                   <pic:blipFill>
-                    <a:blip r:embed="rId14"/>
+                    <a:blip r:embed="rId13"/>
                     <a:stretch>
                       <a:fillRect/>
                     </a:stretch>
@@ -2807,16 +2199,8 @@
       </w:r>
     </w:p>
     <w:p>
-      <w:pPr>
-        <w:pStyle w:val="Heading2"/>
-      </w:pPr>
       <w:r>
-        <w:t>Manual Review Burden</w:t>
-      </w:r>
-    </w:p>
-    <w:p>
-      <w:r>
-        <w:t>The verifier flagged 64 of 238 applicants for manual review, a review rate of 26.9%. Operationally, this means the system could separate a large no-check stream from a smaller targeted review stream. However, the review flag was not a complete detector of residual error. Among applicants with at least one evidence-level error, 34 of 120 were flagged. Among applicants with at least one false negative, 25 of 48 were flagged.</w:t>
+        <w:t>The manual review flag created a smaller operational review queue, but it did not identify every residual error. Among applicants with at least one evidence-level error, 34 of 120 were flagged for review. Among applicants with at least one false negative, 25 of 48 were flagged. This distinction matters: check_required is a workflow-control signal, not a guarantee that all no-check records are error-free.</w:t>
       </w:r>
     </w:p>
     <w:tbl>
@@ -3210,7 +2594,7 @@
         <w:drawing>
           <wp:inline xmlns:a="http://schemas.openxmlformats.org/drawingml/2006/main" xmlns:pic="http://schemas.openxmlformats.org/drawingml/2006/picture">
             <wp:extent cx="6217920" cy="3532909"/>
-            <wp:docPr id="7" name="Picture 7"/>
+            <wp:docPr id="6" name="Picture 6"/>
             <wp:cNvGraphicFramePr>
               <a:graphicFrameLocks noChangeAspect="1"/>
             </wp:cNvGraphicFramePr>
@@ -3222,7 +2606,7 @@
                     <pic:cNvPicPr/>
                   </pic:nvPicPr>
                   <pic:blipFill>
-                    <a:blip r:embed="rId15"/>
+                    <a:blip r:embed="rId14"/>
                     <a:stretch>
                       <a:fillRect/>
                     </a:stretch>
@@ -3255,19 +2639,6 @@
     </w:p>
     <w:p>
       <w:pPr>
-        <w:pStyle w:val="Heading2"/>
-      </w:pPr>
-      <w:r>
-        <w:t>Applicant-Level Agreement</w:t>
-      </w:r>
-    </w:p>
-    <w:p>
-      <w:r>
-        <w:t>Exact applicant-level agreement was 118/238 (49.6%). This is stricter than evidence-level accuracy because all six evidence categories must match the reference standard for the applicant. In a multi-label administrative task, this metric is useful because it reflects the operator's experience: an applicant record can still require attention if even one relevant category is wrong. The difference between high evidence-level accuracy and moderate exact applicant-level agreement reinforces the need for ongoing review sampling and evidence-type-specific recalibration.</w:t>
-      </w:r>
-    </w:p>
-    <w:p>
-      <w:pPr>
         <w:pStyle w:val="Heading1"/>
       </w:pPr>
       <w:r>
@@ -3275,180 +2646,38 @@
       </w:r>
     </w:p>
     <w:p>
-      <w:pPr>
-        <w:pStyle w:val="Heading2"/>
-      </w:pPr>
       <w:r>
-        <w:t>Principal Findings</w:t>
+        <w:t>We developed and evaluated a claim-guided, local-first document evidence verifier for public-sector human-resource applications. The system achieved strong evidence-level performance and reduced the manual review queue to 26.9% of applicants in the validation set. More importantly, it demonstrated a workflow architecture for a problem that is often treated too narrowly as document classification. The verifier makes applicant claims the unit of analysis, uses OCR and visual evidence selectively, constrains local model inference through prompts and schema, and produces outputs designed for human review rather than autonomous decision-making.</w:t>
       </w:r>
     </w:p>
     <w:p>
       <w:r>
-        <w:t>We developed and evaluated a claim-guided, local-first document evidence verifier for public-sector human-resource applications. The method achieved 89.0% evidence-level accuracy and reduced the manual review queue to 26.9% of applicants in the validation set. More importantly, it demonstrated a workable architecture for a difficult administrative AI problem: reading applicant claims, inspecting heterogeneous document evidence, using local multimodal inference only within a constrained harness, and exporting evidence summaries for human review.</w:t>
+        <w:t>The key lesson is that the harness is the method. The local vision-language model provides visual reasoning, especially for scanned or OCR-poor pages, but the model is only one component of a controlled system. The surrounding workflow determines what the model sees, what it is allowed to decide, how output is parsed, and when uncertainty is escalated. This is consistent with healthcare AI reporting guidance, which increasingly emphasises human-AI interaction, workflow context, implementation details and decision-support boundaries rather than model performance alone [16-18].</w:t>
       </w:r>
     </w:p>
     <w:p>
       <w:r>
-        <w:t>The development finding is that workflow design matters as much as model choice. Early broad-classification logic treated the PDF as the primary object. The final method treated the applicant claim as the primary object. This changed the behaviour of the system. It reduced the incentive to label every plausible document and made the verifier more aligned with the administrative task: "Did the applicant upload proof for what they claimed?"</w:t>
-      </w:r>
-    </w:p>
-    <w:p>
-      <w:pPr>
-        <w:pStyle w:val="Heading2"/>
-      </w:pPr>
-      <w:r>
-        <w:t>The Harness Is the Method</w:t>
+        <w:t>The evidence-specific results are also informative. Marriage and examination-related proof performed well because these documents tend to have distinctive titles, official structures, registration numbers or terminology. Family illness and spouse-location proof were more difficult because they require relational interpretation. A document may clearly be medical, but the system must still determine whether the patient is the applicant, spouse, child, parent or another person. A letter may clearly mention a workplace, but the system must determine whether it relates to the spouse and whether it is relevant to placement. Future gains are therefore likely to come from better relationship extraction, name and identity matching, and more disciplined handling of ambiguous third-person documents rather than from simply changing the model.</w:t>
       </w:r>
     </w:p>
     <w:p>
       <w:r>
-        <w:t>The AI component is often described as if the model is the intervention. In this study, the harness is the intervention. The local VLM contributed visual reasoning, especially for OCR-poor evidence, but the model was surrounded by deterministic claim extraction, prompt constraints, OCR-derived signals, JSON schema enforcement, proof-strength rules, caching and manual-review triggers. This is the difference between using an LLM as a general document reader and deploying an AI-assisted evidence verifier.</w:t>
+        <w:t>The appropriate operational posture is AI-assisted triage. A no-check output should mean that the current verifier found sufficient first-pass evidence under current rules, not that the applicant record is beyond error. A check output should mean that human attention is required because proof is missing, ambiguous, low confidence or affected by process failure. A deployment model should include mandatory review of check records, periodic sampling of no-check records, evidence-type-specific monitoring, and recalibration after each application cycle. This is particularly important because the manual review flag did not capture all residual errors in the validation set.</w:t>
       </w:r>
     </w:p>
     <w:p>
       <w:r>
-        <w:t>This design aligns with broader AI reporting guidance. DECIDE-AI emphasises human-AI interaction and early-stage workflow evaluation [16]. TRIPOD+AI and CONSORT-AI similarly stress transparent reporting of the AI component, input data and deployment context [17,18]. For administrative evidence verification, the same principles apply: the relevant object is not only the model's raw prediction, but the complete sociotechnical pathway from input data to human action.</w:t>
-      </w:r>
-    </w:p>
-    <w:p>
-      <w:pPr>
-        <w:pStyle w:val="Heading2"/>
-      </w:pPr>
-      <w:r>
-        <w:t>Interpretation of Performance</w:t>
+        <w:t>This work should not be positioned as a full e-KYC system. It does not verify identity document authenticity, perform face matching, assess liveness, validate NFC chips, screen sanctions lists or detect deliberate forgery. Its contribution is narrower and more defensible: a transparent, local-first method for administrative claim-proof checking. That narrowness is useful because many public-sector workflows need exactly this kind of middle layer between fully manual review and high-assurance identity proofing.</w:t>
       </w:r>
     </w:p>
     <w:p>
       <w:r>
-        <w:t>The verifier performed best when documents had distinctive structure or vocabulary. Marriage certificates and examination-related documents often contain recognisable titles, official forms, registration numbers, candidate names, examination terms or certificates. The model and rules could therefore converge on the same signal.</w:t>
+        <w:t>The study has several strengths. It reports a functioning software workflow rather than a conceptual prototype, evaluates it against a manually adjudicated reference set, reports both evidence-level and applicant-level performance, and preserves an audit path for human reviewers. It also highlights residual error rather than hiding it behind aggregate accuracy. The limitations are equally important. The validation set came from one workflow and may not generalise to future cycles, other document mixes or poorer-quality scans. The manual reference standard may contain reviewer error. Evidence-level decisions are clustered within applicants, so conventional metrics understate uncertainty. The system does not authenticate documents, verify identity or detect fraud beyond inconsistency between claims and evidence. Finally, the current review flag is useful for workload management but is not yet a complete safety net.</w:t>
       </w:r>
     </w:p>
     <w:p>
       <w:r>
-        <w:t>The hardest categories were relational. Family illness requires the system to decide not only whether a document is medical, but whose medical evidence it is and whether that person is related to the applicant. Spouse location requires the system to separate spouse workplace or posting evidence from generic letters, applicant workplace documents or unrelated administrative correspondence. These categories are not only OCR problems; they are relationship-resolution problems. Future improvements should therefore focus on relational extraction, name matching, spouse and dependent linkage, and stricter evidence summaries for ambiguous third-person documents.</w:t>
-      </w:r>
-    </w:p>
-    <w:p>
-      <w:pPr>
-        <w:pStyle w:val="Heading2"/>
-      </w:pPr>
-      <w:r>
-        <w:t>Operational Use</w:t>
-      </w:r>
-    </w:p>
-    <w:p>
-      <w:r>
-        <w:t>The appropriate deployment model is AI-assisted triage. The system can reduce repetitive review and produce a structured queue, but it should not issue autonomous adverse decisions. A no-check result should mean "sufficient first-pass evidence found under current rules", not "human review is never needed". A check result should mean "operator attention is required because evidence is missing, ambiguous, low confidence or affected by process failure".</w:t>
-      </w:r>
-    </w:p>
-    <w:p>
-      <w:r>
-        <w:t>Recommended deployment safeguards include:</w:t>
-      </w:r>
-    </w:p>
-    <w:p>
-      <w:pPr>
-        <w:pStyle w:val="ListBullet"/>
-      </w:pPr>
-      <w:r>
-        <w:t>mandatory review of all check records;</w:t>
-      </w:r>
-    </w:p>
-    <w:p>
-      <w:pPr>
-        <w:pStyle w:val="ListBullet"/>
-      </w:pPr>
-      <w:r>
-        <w:t>random sampling of no-check records;</w:t>
-      </w:r>
-    </w:p>
-    <w:p>
-      <w:pPr>
-        <w:pStyle w:val="ListBullet"/>
-      </w:pPr>
-      <w:r>
-        <w:t>batch-level monitoring of sensitivity, specificity and review rate;</w:t>
-      </w:r>
-    </w:p>
-    <w:p>
-      <w:pPr>
-        <w:pStyle w:val="ListBullet"/>
-      </w:pPr>
-      <w:r>
-        <w:t>evidence-type-specific recalibration, especially for family illness and spouse location;</w:t>
-      </w:r>
-    </w:p>
-    <w:p>
-      <w:pPr>
-        <w:pStyle w:val="ListBullet"/>
-      </w:pPr>
-      <w:r>
-        <w:t>preservation of original PDF links and supporting pages;</w:t>
-      </w:r>
-    </w:p>
-    <w:p>
-      <w:pPr>
-        <w:pStyle w:val="ListBullet"/>
-      </w:pPr>
-      <w:r>
-        <w:t>separate governance for any future move from triage to decision automation.</w:t>
-      </w:r>
-    </w:p>
-    <w:p>
-      <w:pPr>
-        <w:pStyle w:val="Heading2"/>
-      </w:pPr>
-      <w:r>
-        <w:t>Comparison With Full e-KYC Systems</w:t>
-      </w:r>
-    </w:p>
-    <w:p>
-      <w:r>
-        <w:t>The system should not be described as full e-KYC. It does not perform identity document authenticity checks, biometric face matching, liveness detection, NFC or eMRTD chip verification, sanctions screening, device-risk assessment or financial-crime risk scoring. Standards and guidance from FATF, NIST and ICAO are important comparators for digital identity assurance [3-5], but they define a broader assurance stack than this method implements.</w:t>
-      </w:r>
-    </w:p>
-    <w:p>
-      <w:r>
-        <w:t>The contribution here is narrower and useful: a transparent, local-first proof-checking workflow for administrative claims. That narrowness is a strength if stated clearly. It allows the method to be evaluated on the task it was built for, rather than judged against an unrelated identity-proofing endpoint.</w:t>
-      </w:r>
-    </w:p>
-    <w:p>
-      <w:pPr>
-        <w:pStyle w:val="Heading2"/>
-      </w:pPr>
-      <w:r>
-        <w:t>Strengths</w:t>
-      </w:r>
-    </w:p>
-    <w:p>
-      <w:r>
-        <w:t>This study has four strengths. First, it reports a functioning software method rather than a conceptual prototype. Second, it evaluates the method against a manually adjudicated reference set. Third, it reports both evidence-level and applicant-level performance, preventing overinterpretation of aggregate accuracy. Fourth, it preserves operational outputs such as tick sheets, scoring sheets, original links and proof summaries, which makes future quality improvement possible.</w:t>
-      </w:r>
-    </w:p>
-    <w:p>
-      <w:pPr>
-        <w:pStyle w:val="Heading2"/>
-      </w:pPr>
-      <w:r>
-        <w:t>Limitations</w:t>
-      </w:r>
-    </w:p>
-    <w:p>
-      <w:r>
-        <w:t>The validation set included 238 applicants from one administrative workflow. Performance may differ in future application cycles, other document mixes, other languages, poorer scans or different applicant behaviours. The manual reference standard may contain adjudication error. Evidence-level decisions are clustered within applicants, so conventional decision-level metrics understate uncertainty. The system does not authenticate documents, verify identity or detect deliberate forgery. Finally, the current review flag does not catch every residual error and should be treated as a workload control rather than a safety guarantee.</w:t>
-      </w:r>
-    </w:p>
-    <w:p>
-      <w:pPr>
-        <w:pStyle w:val="Heading2"/>
-      </w:pPr>
-      <w:r>
-        <w:t>Future Work</w:t>
-      </w:r>
-    </w:p>
-    <w:p>
-      <w:r>
-        <w:t>Future work should focus on improving relational evidence resolution and governance-readiness. High-yield technical extensions include better spouse and dependent linkage, stronger name and identity-number matching, explicit page-level relation extraction, OCR-free document understanding baselines such as Donut-style models, and systematic comparison of local VLMs. Operational extensions should include drift monitoring, reviewer feedback loops, active-learning queues, calibration dashboards and a model card. Governance work should define data retention, access control, appeal pathways, audit sampling and accountability for human-AI review.</w:t>
+        <w:t>Future work should focus on relationship resolution, calibration and governance. Technically, this means better spouse and dependent linkage, stricter page-level relation extraction, improved multilingual OCR routing, comparison with OCR-free document-understanding baselines, and systematic evaluation of alternative local vision-language models. Operationally, it means reviewer feedback loops, drift monitoring, sampling plans, model cards, data retention rules, access controls and a clear policy for how AI-assisted evidence review affects applicant decisions.</w:t>
       </w:r>
     </w:p>
     <w:p>
@@ -3461,7 +2690,7 @@
     </w:p>
     <w:p>
       <w:r>
-        <w:t>We developed and evaluated a local-first, claim-guided AI-assisted document evidence verifier for public-sector human-resource applications. The method converts structured applicant claims into targeted proof-checking tasks, combines OCR and page-image processing with constrained local VLM inference, and exports auditable outputs for human review. In a 238-applicant validation set, the verifier achieved strong evidence-level performance and reduced the manual review queue to 26.9%. The method is best understood as administrative decision support: a way to make proof checking faster, more consistent and more inspectable, while retaining human accountability for uncertain or consequential cases.</w:t>
+        <w:t>We developed and evaluated a local-first, claim-guided AI-assisted document evidence verifier for public-sector human-resource applications. The method converts structured applicant claims into targeted proof-checking tasks, combines OCR and page-image processing with constrained local multimodal inference, and returns auditable outputs for human review. In a 238-applicant validation set, it achieved strong evidence-level performance and reduced the first-pass manual review queue. The system is best understood as administrative decision support: a way to make evidence review faster, more consistent and more inspectable while preserving human accountability for uncertain or consequential cases.</w:t>
       </w:r>
     </w:p>
     <w:p>
@@ -3487,7 +2716,7 @@
     </w:p>
     <w:p>
       <w:r>
-        <w:t>VJJ: conceptualisation, methodology, software, formal analysis, validation interpretation, writing - original draft. Additional collaborators: data curation, manual validation, governance review, writing - review and editing. To be completed before submission.</w:t>
+        <w:t>VJJ: conceptualisation, methodology, software, formal analysis, validation interpretation and writing of the original draft. Additional collaborators: data curation, manual validation, governance review and critical revision. Author roles should be finalised before submission.</w:t>
       </w:r>
     </w:p>
     <w:p>
@@ -3737,7 +2966,7 @@
         <w:pStyle w:val="ListNumber"/>
       </w:pPr>
       <w:r>
-        <w:t>Dickerson JP, Procaccia AD, Sandholm T. Failure-aware kidney exchange. Management Science. 2019;65(4):1768-1791.</w:t>
+        <w:t>JMIR Publications. What are the article types for JMIR Publications journals? JMIR Publications Support. Accessed 2026-05-07.</w:t>
       </w:r>
     </w:p>
     <w:sectPr>

</xml_diff>